<commit_message>
Atualização Guia de Implantação
</commit_message>
<xml_diff>
--- a/5.Implantação/INST360 - Guia de Implantação.docx
+++ b/5.Implantação/INST360 - Guia de Implantação.docx
@@ -2209,25 +2209,7 @@
           <w:iCs/>
           <w:color w:val="auto"/>
         </w:rPr>
-        <w:t xml:space="preserve">Documento de Arquitetura do Sistema (DAS) - Detalhes do padrão MVC e </w:t>
-      </w:r>
-      <w:proofErr w:type="spellStart"/>
-      <w:r>
-        <w:rPr>
-          <w:i w:val="0"/>
-          <w:iCs/>
-          <w:color w:val="auto"/>
-        </w:rPr>
-        <w:t>Servlets</w:t>
-      </w:r>
-      <w:proofErr w:type="spellEnd"/>
-      <w:r>
-        <w:rPr>
-          <w:i w:val="0"/>
-          <w:iCs/>
-          <w:color w:val="auto"/>
-        </w:rPr>
-        <w:t>.</w:t>
+        <w:t>Documento de Arquitetura do Sistema (DAS) - Detalhes do padrão MVC e Servlets.</w:t>
       </w:r>
     </w:p>
     <w:p>
@@ -2250,44 +2232,6 @@
           <w:color w:val="auto"/>
         </w:rPr>
         <w:t>Manual do Usuário - Guia de operação do sistema para o treinamento.</w:t>
-      </w:r>
-    </w:p>
-    <w:p>
-      <w:pPr>
-        <w:pStyle w:val="Instruo"/>
-        <w:numPr>
-          <w:ilvl w:val="0"/>
-          <w:numId w:val="10"/>
-        </w:numPr>
-        <w:rPr>
-          <w:i w:val="0"/>
-          <w:iCs/>
-          <w:color w:val="auto"/>
-        </w:rPr>
-      </w:pPr>
-      <w:r>
-        <w:rPr>
-          <w:i w:val="0"/>
-          <w:iCs/>
-          <w:color w:val="auto"/>
-        </w:rPr>
-        <w:t>Script de Carga Inicial (</w:t>
-      </w:r>
-      <w:r>
-        <w:rPr>
-          <w:i w:val="0"/>
-          <w:iCs/>
-          <w:color w:val="auto"/>
-        </w:rPr>
-        <w:t>inst360.sql</w:t>
-      </w:r>
-      <w:r>
-        <w:rPr>
-          <w:i w:val="0"/>
-          <w:iCs/>
-          <w:color w:val="auto"/>
-        </w:rPr>
-        <w:t>) - Estrutura e dados iniciais do banco.</w:t>
       </w:r>
     </w:p>
     <w:p>
@@ -2321,43 +2265,7 @@
           <w:iCs/>
           <w:color w:val="auto"/>
         </w:rPr>
-        <w:t>A implantação compreende o empacotamento da aplicação em um arquivo .</w:t>
-      </w:r>
-      <w:proofErr w:type="spellStart"/>
-      <w:r>
-        <w:rPr>
-          <w:i w:val="0"/>
-          <w:iCs/>
-          <w:color w:val="auto"/>
-        </w:rPr>
-        <w:t>war</w:t>
-      </w:r>
-      <w:proofErr w:type="spellEnd"/>
-      <w:r>
-        <w:rPr>
-          <w:i w:val="0"/>
-          <w:iCs/>
-          <w:color w:val="auto"/>
-        </w:rPr>
-        <w:t xml:space="preserve">, a preparação do servidor de banco de dados, a configuração do servidor de aplicação </w:t>
-      </w:r>
-      <w:proofErr w:type="spellStart"/>
-      <w:r>
-        <w:rPr>
-          <w:i w:val="0"/>
-          <w:iCs/>
-          <w:color w:val="auto"/>
-        </w:rPr>
-        <w:t>Tomcat</w:t>
-      </w:r>
-      <w:proofErr w:type="spellEnd"/>
-      <w:r>
-        <w:rPr>
-          <w:i w:val="0"/>
-          <w:iCs/>
-          <w:color w:val="auto"/>
-        </w:rPr>
-        <w:t xml:space="preserve"> e a homologação final junto ao cliente.</w:t>
+        <w:t>A implantação compreende o empacotamento da aplicação em um arquivo .war, a preparação do servidor de banco de dados, a configuração do servidor de aplicação Tomcat e a homologação final junto ao cliente.</w:t>
       </w:r>
     </w:p>
     <w:p>
@@ -2539,45 +2447,8 @@
           <w:sz w:val="22"/>
           <w:szCs w:val="22"/>
         </w:rPr>
-        <w:t>Geração do arquivo .</w:t>
-      </w:r>
-      <w:proofErr w:type="spellStart"/>
-      <w:r>
-        <w:rPr>
-          <w:b/>
-          <w:bCs/>
-          <w:iCs/>
-          <w:color w:val="auto"/>
-          <w:sz w:val="22"/>
-          <w:szCs w:val="22"/>
-        </w:rPr>
-        <w:t>war</w:t>
-      </w:r>
-      <w:proofErr w:type="spellEnd"/>
-      <w:r>
-        <w:rPr>
-          <w:b/>
-          <w:bCs/>
-          <w:iCs/>
-          <w:color w:val="auto"/>
-          <w:sz w:val="22"/>
-          <w:szCs w:val="22"/>
-        </w:rPr>
-        <w:t xml:space="preserve"> e </w:t>
-      </w:r>
-      <w:proofErr w:type="spellStart"/>
-      <w:r>
-        <w:rPr>
-          <w:b/>
-          <w:bCs/>
-          <w:iCs/>
-          <w:color w:val="auto"/>
-          <w:sz w:val="22"/>
-          <w:szCs w:val="22"/>
-        </w:rPr>
-        <w:t>Deploy</w:t>
-      </w:r>
-      <w:proofErr w:type="spellEnd"/>
+        <w:t>Geração do arquivo .war e Deploy</w:t>
+      </w:r>
       <w:r>
         <w:rPr>
           <w:b/>
@@ -2852,29 +2723,7 @@
           <w:sz w:val="22"/>
           <w:szCs w:val="22"/>
         </w:rPr>
-        <w:t xml:space="preserve"> A aplicação rodará localmente (</w:t>
-      </w:r>
-      <w:proofErr w:type="spellStart"/>
-      <w:r>
-        <w:rPr>
-          <w:i w:val="0"/>
-          <w:iCs/>
-          <w:color w:val="auto"/>
-          <w:sz w:val="22"/>
-          <w:szCs w:val="22"/>
-        </w:rPr>
-        <w:t>localhost</w:t>
-      </w:r>
-      <w:proofErr w:type="spellEnd"/>
-      <w:r>
-        <w:rPr>
-          <w:i w:val="0"/>
-          <w:iCs/>
-          <w:color w:val="auto"/>
-          <w:sz w:val="22"/>
-          <w:szCs w:val="22"/>
-        </w:rPr>
-        <w:t xml:space="preserve">), dispensando a necessidade de </w:t>
+        <w:t xml:space="preserve"> A aplicação rodará localmente (localhost), dispensando a necessidade de </w:t>
       </w:r>
     </w:p>
     <w:p>
@@ -2952,9 +2801,8 @@
           <w:sz w:val="22"/>
           <w:szCs w:val="22"/>
         </w:rPr>
-        <w:t xml:space="preserve"> 1 Computador </w:t>
-      </w:r>
-      <w:proofErr w:type="gramStart"/>
+        <w:t xml:space="preserve"> 1 Computador</w:t>
+      </w:r>
       <w:r>
         <w:rPr>
           <w:i w:val="0"/>
@@ -2963,9 +2811,8 @@
           <w:sz w:val="22"/>
           <w:szCs w:val="22"/>
         </w:rPr>
-        <w:t>da computador</w:t>
-      </w:r>
-      <w:proofErr w:type="gramEnd"/>
+        <w:t xml:space="preserve"> do instituto</w:t>
+      </w:r>
       <w:r>
         <w:rPr>
           <w:i w:val="0"/>
@@ -3132,29 +2979,7 @@
           <w:sz w:val="22"/>
           <w:szCs w:val="22"/>
         </w:rPr>
-        <w:t xml:space="preserve"> Apache </w:t>
-      </w:r>
-      <w:proofErr w:type="spellStart"/>
-      <w:r>
-        <w:rPr>
-          <w:i w:val="0"/>
-          <w:iCs/>
-          <w:color w:val="auto"/>
-          <w:sz w:val="22"/>
-          <w:szCs w:val="22"/>
-        </w:rPr>
-        <w:t>Tomcat</w:t>
-      </w:r>
-      <w:proofErr w:type="spellEnd"/>
-      <w:r>
-        <w:rPr>
-          <w:i w:val="0"/>
-          <w:iCs/>
-          <w:color w:val="auto"/>
-          <w:sz w:val="22"/>
-          <w:szCs w:val="22"/>
-        </w:rPr>
-        <w:t xml:space="preserve"> 10.x instalado localmente (Fabricante: Apache Software Foundation / Licença: Gratuita/Código Aberto).</w:t>
+        <w:t xml:space="preserve"> Apache Tomcat 10.x instalado localmente (Fabricante: Apache Software Foundation / Licença: Gratuita/Código Aberto).</w:t>
       </w:r>
     </w:p>
     <w:p/>
@@ -3189,9 +3014,8 @@
           <w:sz w:val="22"/>
           <w:szCs w:val="22"/>
         </w:rPr>
-        <w:t xml:space="preserve"> Java </w:t>
-      </w:r>
-      <w:proofErr w:type="spellStart"/>
+        <w:t xml:space="preserve"> Java Development Kit (JDK) </w:t>
+      </w:r>
       <w:r>
         <w:rPr>
           <w:i w:val="0"/>
@@ -3200,9 +3024,8 @@
           <w:sz w:val="22"/>
           <w:szCs w:val="22"/>
         </w:rPr>
-        <w:t>Development</w:t>
-      </w:r>
-      <w:proofErr w:type="spellEnd"/>
+        <w:t xml:space="preserve">21 </w:t>
+      </w:r>
       <w:r>
         <w:rPr>
           <w:i w:val="0"/>
@@ -3211,71 +3034,7 @@
           <w:sz w:val="22"/>
           <w:szCs w:val="22"/>
         </w:rPr>
-        <w:t xml:space="preserve"> Kit (JDK) </w:t>
-      </w:r>
-      <w:r>
-        <w:rPr>
-          <w:i w:val="0"/>
-          <w:iCs/>
-          <w:color w:val="auto"/>
-          <w:sz w:val="22"/>
-          <w:szCs w:val="22"/>
-        </w:rPr>
-        <w:t xml:space="preserve">21 </w:t>
-      </w:r>
-      <w:r>
-        <w:rPr>
-          <w:i w:val="0"/>
-          <w:iCs/>
-          <w:color w:val="auto"/>
-          <w:sz w:val="22"/>
-          <w:szCs w:val="22"/>
-        </w:rPr>
-        <w:t xml:space="preserve">ou Java </w:t>
-      </w:r>
-      <w:proofErr w:type="spellStart"/>
-      <w:r>
-        <w:rPr>
-          <w:i w:val="0"/>
-          <w:iCs/>
-          <w:color w:val="auto"/>
-          <w:sz w:val="22"/>
-          <w:szCs w:val="22"/>
-        </w:rPr>
-        <w:t>Runtime</w:t>
-      </w:r>
-      <w:proofErr w:type="spellEnd"/>
-      <w:r>
-        <w:rPr>
-          <w:i w:val="0"/>
-          <w:iCs/>
-          <w:color w:val="auto"/>
-          <w:sz w:val="22"/>
-          <w:szCs w:val="22"/>
-        </w:rPr>
-        <w:t xml:space="preserve"> </w:t>
-      </w:r>
-      <w:proofErr w:type="spellStart"/>
-      <w:r>
-        <w:rPr>
-          <w:i w:val="0"/>
-          <w:iCs/>
-          <w:color w:val="auto"/>
-          <w:sz w:val="22"/>
-          <w:szCs w:val="22"/>
-        </w:rPr>
-        <w:t>Environment</w:t>
-      </w:r>
-      <w:proofErr w:type="spellEnd"/>
-      <w:r>
-        <w:rPr>
-          <w:i w:val="0"/>
-          <w:iCs/>
-          <w:color w:val="auto"/>
-          <w:sz w:val="22"/>
-          <w:szCs w:val="22"/>
-        </w:rPr>
-        <w:t xml:space="preserve"> (JRE) instalado e configurado nas variáveis de ambiente do Windows (Licença: Gratuita para fins acadêmicos/desenvolvimento).</w:t>
+        <w:t>ou Java Runtime Environment (JRE) instalado e configurado nas variáveis de ambiente do Windows (Licença: Gratuita para fins acadêmicos/desenvolvimento).</w:t>
       </w:r>
     </w:p>
     <w:p/>
@@ -3300,23 +3059,7 @@
           <w:sz w:val="22"/>
           <w:szCs w:val="22"/>
         </w:rPr>
-        <w:t xml:space="preserve"> Apache </w:t>
-      </w:r>
-      <w:proofErr w:type="spellStart"/>
-      <w:r>
-        <w:rPr>
-          <w:sz w:val="22"/>
-          <w:szCs w:val="22"/>
-        </w:rPr>
-        <w:t>Maven</w:t>
-      </w:r>
-      <w:proofErr w:type="spellEnd"/>
-      <w:r>
-        <w:rPr>
-          <w:sz w:val="22"/>
-          <w:szCs w:val="22"/>
-        </w:rPr>
-        <w:t xml:space="preserve"> 3.9.x (Fabricante: Apache Software Foundation / Licença: Gratuita/Código Aberto).</w:t>
+        <w:t xml:space="preserve"> Apache Maven 3.9.x (Fabricante: Apache Software Foundation / Licença: Gratuita/Código Aberto).</w:t>
       </w:r>
     </w:p>
     <w:p/>
@@ -3351,95 +3094,7 @@
           <w:sz w:val="22"/>
           <w:szCs w:val="22"/>
         </w:rPr>
-        <w:t xml:space="preserve"> PostgreSQL 15 (ou superior) instalado localmente ou via ferramenta </w:t>
-      </w:r>
-      <w:proofErr w:type="spellStart"/>
-      <w:r>
-        <w:rPr>
-          <w:i w:val="0"/>
-          <w:iCs/>
-          <w:color w:val="auto"/>
-          <w:sz w:val="22"/>
-          <w:szCs w:val="22"/>
-        </w:rPr>
-        <w:t>pgAdmin</w:t>
-      </w:r>
-      <w:proofErr w:type="spellEnd"/>
-      <w:r>
-        <w:rPr>
-          <w:i w:val="0"/>
-          <w:iCs/>
-          <w:color w:val="auto"/>
-          <w:sz w:val="22"/>
-          <w:szCs w:val="22"/>
-        </w:rPr>
-        <w:t xml:space="preserve"> 4 (Fabricante: PostgreSQL Global </w:t>
-      </w:r>
-      <w:proofErr w:type="spellStart"/>
-      <w:r>
-        <w:rPr>
-          <w:i w:val="0"/>
-          <w:iCs/>
-          <w:color w:val="auto"/>
-          <w:sz w:val="22"/>
-          <w:szCs w:val="22"/>
-        </w:rPr>
-        <w:t>Development</w:t>
-      </w:r>
-      <w:proofErr w:type="spellEnd"/>
-      <w:r>
-        <w:rPr>
-          <w:i w:val="0"/>
-          <w:iCs/>
-          <w:color w:val="auto"/>
-          <w:sz w:val="22"/>
-          <w:szCs w:val="22"/>
-        </w:rPr>
-        <w:t xml:space="preserve"> </w:t>
-      </w:r>
-      <w:proofErr w:type="spellStart"/>
-      <w:r>
-        <w:rPr>
-          <w:i w:val="0"/>
-          <w:iCs/>
-          <w:color w:val="auto"/>
-          <w:sz w:val="22"/>
-          <w:szCs w:val="22"/>
-        </w:rPr>
-        <w:t>Group</w:t>
-      </w:r>
-      <w:proofErr w:type="spellEnd"/>
-      <w:r>
-        <w:rPr>
-          <w:i w:val="0"/>
-          <w:iCs/>
-          <w:color w:val="auto"/>
-          <w:sz w:val="22"/>
-          <w:szCs w:val="22"/>
-        </w:rPr>
-        <w:t xml:space="preserve"> / Licença: Gratuita/Código Aberto - PostgreSQL </w:t>
-      </w:r>
-      <w:proofErr w:type="spellStart"/>
-      <w:r>
-        <w:rPr>
-          <w:i w:val="0"/>
-          <w:iCs/>
-          <w:color w:val="auto"/>
-          <w:sz w:val="22"/>
-          <w:szCs w:val="22"/>
-        </w:rPr>
-        <w:t>License</w:t>
-      </w:r>
-      <w:proofErr w:type="spellEnd"/>
-      <w:r>
-        <w:rPr>
-          <w:i w:val="0"/>
-          <w:iCs/>
-          <w:color w:val="auto"/>
-          <w:sz w:val="22"/>
-          <w:szCs w:val="22"/>
-        </w:rPr>
-        <w:t>).</w:t>
+        <w:t xml:space="preserve"> PostgreSQL 15 (ou superior) instalado localmente ou via ferramenta pgAdmin 4 (Fabricante: PostgreSQL Global Development Group / Licença: Gratuita/Código Aberto - PostgreSQL License).</w:t>
       </w:r>
     </w:p>
     <w:p/>
@@ -3529,29 +3184,7 @@
           <w:sz w:val="22"/>
           <w:szCs w:val="22"/>
         </w:rPr>
-        <w:t xml:space="preserve"> Responsável por iniciar o banco de dados local, iniciar o servidor </w:t>
-      </w:r>
-      <w:proofErr w:type="spellStart"/>
-      <w:r>
-        <w:rPr>
-          <w:i w:val="0"/>
-          <w:iCs/>
-          <w:color w:val="auto"/>
-          <w:sz w:val="22"/>
-          <w:szCs w:val="22"/>
-        </w:rPr>
-        <w:t>Tomcat</w:t>
-      </w:r>
-      <w:proofErr w:type="spellEnd"/>
-      <w:r>
-        <w:rPr>
-          <w:i w:val="0"/>
-          <w:iCs/>
-          <w:color w:val="auto"/>
-          <w:sz w:val="22"/>
-          <w:szCs w:val="22"/>
-        </w:rPr>
-        <w:t xml:space="preserve"> e projetar a tela do sistema.</w:t>
+        <w:t xml:space="preserve"> Responsável por iniciar o banco de dados local, iniciar o servidor Tomcat e projetar a tela do sistema.</w:t>
       </w:r>
     </w:p>
     <w:p/>
@@ -3625,37 +3258,7 @@
           <w:szCs w:val="22"/>
           <w:lang w:eastAsia="en-US"/>
         </w:rPr>
-        <w:t xml:space="preserve">Passo </w:t>
-      </w:r>
-      <w:r>
-        <w:rPr>
-          <w:b/>
-          <w:bCs/>
-          <w:sz w:val="22"/>
-          <w:szCs w:val="22"/>
-          <w:lang w:eastAsia="en-US"/>
-        </w:rPr>
-        <w:t>1</w:t>
-      </w:r>
-      <w:r>
-        <w:rPr>
-          <w:b/>
-          <w:bCs/>
-          <w:sz w:val="22"/>
-          <w:szCs w:val="22"/>
-          <w:lang w:eastAsia="en-US"/>
-        </w:rPr>
-        <w:t xml:space="preserve">: </w:t>
-      </w:r>
-      <w:r>
-        <w:rPr>
-          <w:b/>
-          <w:bCs/>
-          <w:sz w:val="22"/>
-          <w:szCs w:val="22"/>
-          <w:lang w:eastAsia="en-US"/>
-        </w:rPr>
-        <w:t>Instalação do TOMCAT</w:t>
+        <w:t>Passo 1: Instalação do TOMCAT</w:t>
       </w:r>
     </w:p>
     <w:p>
@@ -3984,21 +3587,7 @@
         <w:rPr>
           <w:lang w:eastAsia="en-US"/>
         </w:rPr>
-        <w:t>Valor da variável: O caminho da pasta do JDK (</w:t>
-      </w:r>
-      <w:proofErr w:type="spellStart"/>
-      <w:r>
-        <w:rPr>
-          <w:lang w:eastAsia="en-US"/>
-        </w:rPr>
-        <w:t>Ex</w:t>
-      </w:r>
-      <w:proofErr w:type="spellEnd"/>
-      <w:r>
-        <w:rPr>
-          <w:lang w:eastAsia="en-US"/>
-        </w:rPr>
-        <w:t>: C:\Program Files\Java\jdk-17).</w:t>
+        <w:t>Valor da variável: O caminho da pasta do JDK (Ex: C:\Program Files\Java\jdk-17).</w:t>
       </w:r>
     </w:p>
     <w:p>
@@ -4146,29 +3735,7 @@
           <w:szCs w:val="22"/>
           <w:lang w:eastAsia="en-US"/>
         </w:rPr>
-        <w:t xml:space="preserve">: Configuração do </w:t>
-      </w:r>
-      <w:proofErr w:type="spellStart"/>
-      <w:r>
-        <w:rPr>
-          <w:b/>
-          <w:bCs/>
-          <w:sz w:val="22"/>
-          <w:szCs w:val="22"/>
-          <w:lang w:eastAsia="en-US"/>
-        </w:rPr>
-        <w:t>Maven</w:t>
-      </w:r>
-      <w:proofErr w:type="spellEnd"/>
-      <w:r>
-        <w:rPr>
-          <w:b/>
-          <w:bCs/>
-          <w:sz w:val="22"/>
-          <w:szCs w:val="22"/>
-          <w:lang w:eastAsia="en-US"/>
-        </w:rPr>
-        <w:t xml:space="preserve"> nas Variáveis de Ambiente</w:t>
+        <w:t>: Configuração do Maven nas Variáveis de Ambiente</w:t>
       </w:r>
     </w:p>
     <w:p>
@@ -4194,35 +3761,7 @@
         <w:rPr>
           <w:lang w:eastAsia="en-US"/>
         </w:rPr>
-        <w:t xml:space="preserve">Extraia o arquivo .zip do Apache </w:t>
-      </w:r>
-      <w:proofErr w:type="spellStart"/>
-      <w:r>
-        <w:rPr>
-          <w:lang w:eastAsia="en-US"/>
-        </w:rPr>
-        <w:t>Maven</w:t>
-      </w:r>
-      <w:proofErr w:type="spellEnd"/>
-      <w:r>
-        <w:rPr>
-          <w:lang w:eastAsia="en-US"/>
-        </w:rPr>
-        <w:t xml:space="preserve"> em uma pasta de sua preferência (</w:t>
-      </w:r>
-      <w:proofErr w:type="spellStart"/>
-      <w:r>
-        <w:rPr>
-          <w:lang w:eastAsia="en-US"/>
-        </w:rPr>
-        <w:t>Ex</w:t>
-      </w:r>
-      <w:proofErr w:type="spellEnd"/>
-      <w:r>
-        <w:rPr>
-          <w:lang w:eastAsia="en-US"/>
-        </w:rPr>
-        <w:t>: C:\apache-maven-3.9.x).</w:t>
+        <w:t>Extraia o arquivo .zip do Apache Maven em uma pasta de sua preferência (Ex: C:\apache-maven-3.9.x).</w:t>
       </w:r>
     </w:p>
     <w:p>
@@ -4306,35 +3845,7 @@
         <w:rPr>
           <w:lang w:eastAsia="en-US"/>
         </w:rPr>
-        <w:t xml:space="preserve">Valor da variável: O caminho da pasta do </w:t>
-      </w:r>
-      <w:proofErr w:type="spellStart"/>
-      <w:r>
-        <w:rPr>
-          <w:lang w:eastAsia="en-US"/>
-        </w:rPr>
-        <w:t>Maven</w:t>
-      </w:r>
-      <w:proofErr w:type="spellEnd"/>
-      <w:r>
-        <w:rPr>
-          <w:lang w:eastAsia="en-US"/>
-        </w:rPr>
-        <w:t xml:space="preserve"> (</w:t>
-      </w:r>
-      <w:proofErr w:type="spellStart"/>
-      <w:r>
-        <w:rPr>
-          <w:lang w:eastAsia="en-US"/>
-        </w:rPr>
-        <w:t>Ex</w:t>
-      </w:r>
-      <w:proofErr w:type="spellEnd"/>
-      <w:r>
-        <w:rPr>
-          <w:lang w:eastAsia="en-US"/>
-        </w:rPr>
-        <w:t>: C:\apache-maven-3.9.x).</w:t>
+        <w:t>Valor da variável: O caminho da pasta do Maven (Ex: C:\apache-maven-3.9.x).</w:t>
       </w:r>
     </w:p>
     <w:p>
@@ -4506,7 +4017,6 @@
         </w:rPr>
         <w:t xml:space="preserve">Abra a ferramenta </w:t>
       </w:r>
-      <w:proofErr w:type="spellStart"/>
       <w:r>
         <w:rPr>
           <w:b/>
@@ -4514,17 +4024,7 @@
           <w:iCs/>
           <w:color w:val="auto"/>
         </w:rPr>
-        <w:t>pgAdmin</w:t>
-      </w:r>
-      <w:proofErr w:type="spellEnd"/>
-      <w:r>
-        <w:rPr>
-          <w:b/>
-          <w:bCs/>
-          <w:iCs/>
-          <w:color w:val="auto"/>
-        </w:rPr>
-        <w:t xml:space="preserve"> 4</w:t>
+        <w:t>pgAdmin 4</w:t>
       </w:r>
       <w:r>
         <w:rPr>
@@ -4550,39 +4050,7 @@
           <w:iCs/>
           <w:color w:val="auto"/>
         </w:rPr>
-        <w:t xml:space="preserve">Conecte-se ao servidor local, clique com o botão direito em </w:t>
-      </w:r>
-      <w:proofErr w:type="spellStart"/>
-      <w:r>
-        <w:rPr>
-          <w:iCs/>
-          <w:color w:val="auto"/>
-        </w:rPr>
-        <w:t>Databases</w:t>
-      </w:r>
-      <w:proofErr w:type="spellEnd"/>
-      <w:r>
-        <w:rPr>
-          <w:iCs/>
-          <w:color w:val="auto"/>
-        </w:rPr>
-        <w:t xml:space="preserve"> e selecione </w:t>
-      </w:r>
-      <w:proofErr w:type="spellStart"/>
-      <w:r>
-        <w:rPr>
-          <w:iCs/>
-          <w:color w:val="auto"/>
-        </w:rPr>
-        <w:t>Create</w:t>
-      </w:r>
-      <w:proofErr w:type="spellEnd"/>
-      <w:r>
-        <w:rPr>
-          <w:iCs/>
-          <w:color w:val="auto"/>
-        </w:rPr>
-        <w:t xml:space="preserve"> </w:t>
+        <w:t xml:space="preserve">Conecte-se ao servidor local, clique com o botão direito em Databases e selecione Create </w:t>
       </w:r>
       <w:r>
         <w:rPr>
@@ -4596,23 +4064,7 @@
           <w:iCs/>
           <w:color w:val="auto"/>
         </w:rPr>
-        <w:t xml:space="preserve">&gt; </w:t>
-      </w:r>
-      <w:proofErr w:type="spellStart"/>
-      <w:r>
-        <w:rPr>
-          <w:iCs/>
-          <w:color w:val="auto"/>
-        </w:rPr>
-        <w:t>Database</w:t>
-      </w:r>
-      <w:proofErr w:type="spellEnd"/>
-      <w:r>
-        <w:rPr>
-          <w:iCs/>
-          <w:color w:val="auto"/>
-        </w:rPr>
-        <w:t>....</w:t>
+        <w:t>&gt; Database....</w:t>
       </w:r>
     </w:p>
     <w:p>
@@ -4752,28 +4204,26 @@
           <w:color w:val="auto"/>
           <w:lang w:val="en-US"/>
         </w:rPr>
-        <w:t xml:space="preserve">CREATE TABLE </w:t>
-      </w:r>
-      <w:proofErr w:type="spellStart"/>
-      <w:proofErr w:type="gramStart"/>
-      <w:r>
+        <w:t>CREATE TABLE usuarios(</w:t>
+      </w:r>
+    </w:p>
+    <w:p>
+      <w:pPr>
+        <w:ind w:left="708"/>
         <w:rPr>
           <w:iCs/>
           <w:color w:val="auto"/>
           <w:lang w:val="en-US"/>
         </w:rPr>
-        <w:t>usuarios</w:t>
-      </w:r>
-      <w:proofErr w:type="spellEnd"/>
+      </w:pPr>
       <w:r>
         <w:rPr>
           <w:iCs/>
           <w:color w:val="auto"/>
           <w:lang w:val="en-US"/>
         </w:rPr>
-        <w:t>(</w:t>
-      </w:r>
-      <w:proofErr w:type="gramEnd"/>
+        <w:t xml:space="preserve">    id SERIAL PRIMARY KEY,</w:t>
+      </w:r>
     </w:p>
     <w:p>
       <w:pPr>
@@ -4790,7 +4240,7 @@
           <w:color w:val="auto"/>
           <w:lang w:val="en-US"/>
         </w:rPr>
-        <w:t xml:space="preserve">    id SERIAL PRIMARY KEY,</w:t>
+        <w:t xml:space="preserve">    nome VARCHAR(100) NOT NULL,</w:t>
       </w:r>
     </w:p>
     <w:p>
@@ -4808,43 +4258,90 @@
           <w:color w:val="auto"/>
           <w:lang w:val="en-US"/>
         </w:rPr>
+        <w:t xml:space="preserve">    matricula VARCHAR(9) NOT NULL,</w:t>
+      </w:r>
+    </w:p>
+    <w:p>
+      <w:pPr>
+        <w:ind w:left="708"/>
+        <w:rPr>
+          <w:iCs/>
+          <w:color w:val="auto"/>
+        </w:rPr>
+      </w:pPr>
+      <w:r>
+        <w:rPr>
+          <w:iCs/>
+          <w:color w:val="auto"/>
+          <w:lang w:val="en-US"/>
+        </w:rPr>
         <w:t xml:space="preserve">    </w:t>
       </w:r>
-      <w:proofErr w:type="spellStart"/>
-      <w:r>
+      <w:r>
+        <w:rPr>
+          <w:iCs/>
+          <w:color w:val="auto"/>
+        </w:rPr>
+        <w:t>endereco VARCHAR(255),</w:t>
+      </w:r>
+    </w:p>
+    <w:p>
+      <w:pPr>
+        <w:ind w:left="708"/>
+        <w:rPr>
+          <w:iCs/>
+          <w:color w:val="auto"/>
+        </w:rPr>
+      </w:pPr>
+      <w:r>
+        <w:rPr>
+          <w:iCs/>
+          <w:color w:val="auto"/>
+        </w:rPr>
+        <w:t xml:space="preserve">    data_nasc DATE,</w:t>
+      </w:r>
+    </w:p>
+    <w:p>
+      <w:pPr>
+        <w:ind w:left="708"/>
         <w:rPr>
           <w:iCs/>
           <w:color w:val="auto"/>
           <w:lang w:val="en-US"/>
         </w:rPr>
-        <w:t>nome</w:t>
-      </w:r>
-      <w:proofErr w:type="spellEnd"/>
+      </w:pPr>
+      <w:r>
+        <w:rPr>
+          <w:iCs/>
+          <w:color w:val="auto"/>
+        </w:rPr>
+        <w:t xml:space="preserve">    </w:t>
+      </w:r>
       <w:r>
         <w:rPr>
           <w:iCs/>
           <w:color w:val="auto"/>
           <w:lang w:val="en-US"/>
         </w:rPr>
-        <w:t xml:space="preserve"> </w:t>
-      </w:r>
-      <w:proofErr w:type="gramStart"/>
-      <w:r>
+        <w:t>email VARCHAR(150),</w:t>
+      </w:r>
+    </w:p>
+    <w:p>
+      <w:pPr>
+        <w:ind w:left="708"/>
         <w:rPr>
           <w:iCs/>
           <w:color w:val="auto"/>
           <w:lang w:val="en-US"/>
         </w:rPr>
-        <w:t>VARCHAR(</w:t>
-      </w:r>
-      <w:proofErr w:type="gramEnd"/>
+      </w:pPr>
       <w:r>
         <w:rPr>
           <w:iCs/>
           <w:color w:val="auto"/>
           <w:lang w:val="en-US"/>
         </w:rPr>
-        <w:t>100) NOT NULL,</w:t>
+        <w:t xml:space="preserve">    data_cad TIMESTAMP DEFAULT CURRENT_TIMESTAMP,</w:t>
       </w:r>
     </w:p>
     <w:p>
@@ -4862,309 +4359,49 @@
           <w:color w:val="auto"/>
           <w:lang w:val="en-US"/>
         </w:rPr>
+        <w:t xml:space="preserve">    senha VARCHAR(255) NOT NULL,</w:t>
+      </w:r>
+    </w:p>
+    <w:p>
+      <w:pPr>
+        <w:ind w:left="708"/>
+        <w:rPr>
+          <w:iCs/>
+          <w:color w:val="auto"/>
+          <w:lang w:val="en-US"/>
+        </w:rPr>
+      </w:pPr>
+      <w:r>
+        <w:rPr>
+          <w:iCs/>
+          <w:color w:val="auto"/>
+          <w:lang w:val="en-US"/>
+        </w:rPr>
+        <w:t xml:space="preserve">    usuario_valido BOOLEAN DEFAULT FALSE</w:t>
+      </w:r>
+    </w:p>
+    <w:p>
+      <w:pPr>
+        <w:ind w:left="708"/>
+        <w:rPr>
+          <w:iCs/>
+          <w:color w:val="auto"/>
+        </w:rPr>
+      </w:pPr>
+      <w:r>
+        <w:rPr>
+          <w:iCs/>
+          <w:color w:val="auto"/>
+          <w:lang w:val="en-US"/>
+        </w:rPr>
         <w:t xml:space="preserve">    </w:t>
       </w:r>
-      <w:proofErr w:type="gramStart"/>
-      <w:r>
-        <w:rPr>
-          <w:iCs/>
-          <w:color w:val="auto"/>
-          <w:lang w:val="en-US"/>
-        </w:rPr>
-        <w:t>matricula</w:t>
-      </w:r>
-      <w:proofErr w:type="gramEnd"/>
-      <w:r>
-        <w:rPr>
-          <w:iCs/>
-          <w:color w:val="auto"/>
-          <w:lang w:val="en-US"/>
-        </w:rPr>
-        <w:t xml:space="preserve"> </w:t>
-      </w:r>
-      <w:proofErr w:type="gramStart"/>
-      <w:r>
-        <w:rPr>
-          <w:iCs/>
-          <w:color w:val="auto"/>
-          <w:lang w:val="en-US"/>
-        </w:rPr>
-        <w:t>VARCHAR(</w:t>
-      </w:r>
-      <w:proofErr w:type="gramEnd"/>
-      <w:r>
-        <w:rPr>
-          <w:iCs/>
-          <w:color w:val="auto"/>
-          <w:lang w:val="en-US"/>
-        </w:rPr>
-        <w:t>9) NOT NULL,</w:t>
-      </w:r>
-    </w:p>
-    <w:p>
-      <w:pPr>
-        <w:ind w:left="708"/>
-        <w:rPr>
-          <w:iCs/>
-          <w:color w:val="auto"/>
-        </w:rPr>
-      </w:pPr>
-      <w:r>
-        <w:rPr>
-          <w:iCs/>
-          <w:color w:val="auto"/>
-          <w:lang w:val="en-US"/>
-        </w:rPr>
-        <w:t xml:space="preserve">    </w:t>
-      </w:r>
-      <w:proofErr w:type="spellStart"/>
-      <w:r>
-        <w:rPr>
-          <w:iCs/>
-          <w:color w:val="auto"/>
-        </w:rPr>
-        <w:t>endereco</w:t>
-      </w:r>
-      <w:proofErr w:type="spellEnd"/>
-      <w:r>
-        <w:rPr>
-          <w:iCs/>
-          <w:color w:val="auto"/>
-        </w:rPr>
-        <w:t xml:space="preserve"> </w:t>
-      </w:r>
-      <w:proofErr w:type="gramStart"/>
-      <w:r>
-        <w:rPr>
-          <w:iCs/>
-          <w:color w:val="auto"/>
-        </w:rPr>
-        <w:t>VARCHAR(</w:t>
-      </w:r>
-      <w:proofErr w:type="gramEnd"/>
-      <w:r>
-        <w:rPr>
-          <w:iCs/>
-          <w:color w:val="auto"/>
-        </w:rPr>
-        <w:t>255),</w:t>
-      </w:r>
-    </w:p>
-    <w:p>
-      <w:pPr>
-        <w:ind w:left="708"/>
-        <w:rPr>
-          <w:iCs/>
-          <w:color w:val="auto"/>
-        </w:rPr>
-      </w:pPr>
-      <w:r>
-        <w:rPr>
-          <w:iCs/>
-          <w:color w:val="auto"/>
-        </w:rPr>
-        <w:t xml:space="preserve">    </w:t>
-      </w:r>
-      <w:proofErr w:type="spellStart"/>
-      <w:r>
-        <w:rPr>
-          <w:iCs/>
-          <w:color w:val="auto"/>
-        </w:rPr>
-        <w:t>data_nasc</w:t>
-      </w:r>
-      <w:proofErr w:type="spellEnd"/>
-      <w:r>
-        <w:rPr>
-          <w:iCs/>
-          <w:color w:val="auto"/>
-        </w:rPr>
-        <w:t xml:space="preserve"> DATE,</w:t>
-      </w:r>
-    </w:p>
-    <w:p>
-      <w:pPr>
-        <w:ind w:left="708"/>
-        <w:rPr>
-          <w:iCs/>
-          <w:color w:val="auto"/>
-          <w:lang w:val="en-US"/>
-        </w:rPr>
-      </w:pPr>
-      <w:r>
-        <w:rPr>
-          <w:iCs/>
-          <w:color w:val="auto"/>
-        </w:rPr>
-        <w:t xml:space="preserve">    </w:t>
-      </w:r>
-      <w:r>
-        <w:rPr>
-          <w:iCs/>
-          <w:color w:val="auto"/>
-          <w:lang w:val="en-US"/>
-        </w:rPr>
-        <w:t xml:space="preserve">email </w:t>
-      </w:r>
-      <w:proofErr w:type="gramStart"/>
-      <w:r>
-        <w:rPr>
-          <w:iCs/>
-          <w:color w:val="auto"/>
-          <w:lang w:val="en-US"/>
-        </w:rPr>
-        <w:t>VARCHAR(</w:t>
-      </w:r>
-      <w:proofErr w:type="gramEnd"/>
-      <w:r>
-        <w:rPr>
-          <w:iCs/>
-          <w:color w:val="auto"/>
-          <w:lang w:val="en-US"/>
-        </w:rPr>
-        <w:t>150),</w:t>
-      </w:r>
-    </w:p>
-    <w:p>
-      <w:pPr>
-        <w:ind w:left="708"/>
-        <w:rPr>
-          <w:iCs/>
-          <w:color w:val="auto"/>
-          <w:lang w:val="en-US"/>
-        </w:rPr>
-      </w:pPr>
-      <w:r>
-        <w:rPr>
-          <w:iCs/>
-          <w:color w:val="auto"/>
-          <w:lang w:val="en-US"/>
-        </w:rPr>
-        <w:t xml:space="preserve">    </w:t>
-      </w:r>
-      <w:proofErr w:type="spellStart"/>
-      <w:r>
-        <w:rPr>
-          <w:iCs/>
-          <w:color w:val="auto"/>
-          <w:lang w:val="en-US"/>
-        </w:rPr>
-        <w:t>data_cad</w:t>
-      </w:r>
-      <w:proofErr w:type="spellEnd"/>
-      <w:r>
-        <w:rPr>
-          <w:iCs/>
-          <w:color w:val="auto"/>
-          <w:lang w:val="en-US"/>
-        </w:rPr>
-        <w:t xml:space="preserve"> TIMESTAMP DEFAULT CURRENT_TIMESTAMP,</w:t>
-      </w:r>
-    </w:p>
-    <w:p>
-      <w:pPr>
-        <w:ind w:left="708"/>
-        <w:rPr>
-          <w:iCs/>
-          <w:color w:val="auto"/>
-          <w:lang w:val="en-US"/>
-        </w:rPr>
-      </w:pPr>
-      <w:r>
-        <w:rPr>
-          <w:iCs/>
-          <w:color w:val="auto"/>
-          <w:lang w:val="en-US"/>
-        </w:rPr>
-        <w:t xml:space="preserve">    </w:t>
-      </w:r>
-      <w:proofErr w:type="spellStart"/>
-      <w:r>
-        <w:rPr>
-          <w:iCs/>
-          <w:color w:val="auto"/>
-          <w:lang w:val="en-US"/>
-        </w:rPr>
-        <w:t>senha</w:t>
-      </w:r>
-      <w:proofErr w:type="spellEnd"/>
-      <w:r>
-        <w:rPr>
-          <w:iCs/>
-          <w:color w:val="auto"/>
-          <w:lang w:val="en-US"/>
-        </w:rPr>
-        <w:t xml:space="preserve"> </w:t>
-      </w:r>
-      <w:proofErr w:type="gramStart"/>
-      <w:r>
-        <w:rPr>
-          <w:iCs/>
-          <w:color w:val="auto"/>
-          <w:lang w:val="en-US"/>
-        </w:rPr>
-        <w:t>VARCHAR(</w:t>
-      </w:r>
-      <w:proofErr w:type="gramEnd"/>
-      <w:r>
-        <w:rPr>
-          <w:iCs/>
-          <w:color w:val="auto"/>
-          <w:lang w:val="en-US"/>
-        </w:rPr>
-        <w:t>255) NOT NULL,</w:t>
-      </w:r>
-    </w:p>
-    <w:p>
-      <w:pPr>
-        <w:ind w:left="708"/>
-        <w:rPr>
-          <w:iCs/>
-          <w:color w:val="auto"/>
-          <w:lang w:val="en-US"/>
-        </w:rPr>
-      </w:pPr>
-      <w:r>
-        <w:rPr>
-          <w:iCs/>
-          <w:color w:val="auto"/>
-          <w:lang w:val="en-US"/>
-        </w:rPr>
-        <w:t xml:space="preserve">    </w:t>
-      </w:r>
-      <w:proofErr w:type="spellStart"/>
-      <w:r>
-        <w:rPr>
-          <w:iCs/>
-          <w:color w:val="auto"/>
-          <w:lang w:val="en-US"/>
-        </w:rPr>
-        <w:t>usuario_valido</w:t>
-      </w:r>
-      <w:proofErr w:type="spellEnd"/>
-      <w:r>
-        <w:rPr>
-          <w:iCs/>
-          <w:color w:val="auto"/>
-          <w:lang w:val="en-US"/>
-        </w:rPr>
-        <w:t xml:space="preserve"> BOOLEAN DEFAULT FALSE</w:t>
-      </w:r>
-    </w:p>
-    <w:p>
-      <w:pPr>
-        <w:ind w:left="708"/>
-        <w:rPr>
-          <w:iCs/>
-          <w:color w:val="auto"/>
-        </w:rPr>
-      </w:pPr>
-      <w:r>
-        <w:rPr>
-          <w:iCs/>
-          <w:color w:val="auto"/>
-        </w:rPr>
-        <w:t xml:space="preserve">    administrador BOOLEAN DEFAULT FALSE);</w:t>
+      <w:r>
+        <w:rPr>
+          <w:iCs/>
+          <w:color w:val="auto"/>
+        </w:rPr>
+        <w:t>administrador BOOLEAN DEFAULT FALSE);</w:t>
       </w:r>
     </w:p>
     <w:p>
@@ -5210,19 +4447,8 @@
           <w:sz w:val="22"/>
           <w:szCs w:val="22"/>
         </w:rPr>
-        <w:t>: Baixar Repositório e copiar .</w:t>
-      </w:r>
-      <w:proofErr w:type="spellStart"/>
-      <w:r>
-        <w:rPr>
-          <w:b/>
-          <w:bCs/>
-          <w:sz w:val="22"/>
-          <w:szCs w:val="22"/>
-        </w:rPr>
-        <w:t>war</w:t>
-      </w:r>
-      <w:proofErr w:type="spellEnd"/>
+        <w:t>: Baixar Repositório e copiar .war</w:t>
+      </w:r>
     </w:p>
     <w:p>
       <w:pPr>
@@ -5254,23 +4480,7 @@
         </w:numPr>
       </w:pPr>
       <w:r>
-        <w:t>Siga o caminho “3. Implementação” -&gt; “código-fonte” -&gt; selecione a Branch “</w:t>
-      </w:r>
-      <w:proofErr w:type="spellStart"/>
-      <w:r>
-        <w:t>main</w:t>
-      </w:r>
-      <w:proofErr w:type="spellEnd"/>
-      <w:r>
-        <w:t>” -&gt; clique em “</w:t>
-      </w:r>
-      <w:proofErr w:type="spellStart"/>
-      <w:r>
-        <w:t>Code</w:t>
-      </w:r>
-      <w:proofErr w:type="spellEnd"/>
-      <w:r>
-        <w:t>” e depois em “Download .ZIP”.</w:t>
+        <w:t>Siga o caminho “3. Implementação” -&gt; “código-fonte” -&gt; selecione a Branch “main” -&gt; clique em “Code” e depois em “Download .ZIP”.</w:t>
       </w:r>
     </w:p>
     <w:p>
@@ -5320,39 +4530,8 @@
           <w:sz w:val="22"/>
           <w:szCs w:val="22"/>
         </w:rPr>
-        <w:t xml:space="preserve">: </w:t>
-      </w:r>
-      <w:proofErr w:type="spellStart"/>
-      <w:r>
-        <w:rPr>
-          <w:b/>
-          <w:bCs/>
-          <w:sz w:val="22"/>
-          <w:szCs w:val="22"/>
-        </w:rPr>
-        <w:t>Deploy</w:t>
-      </w:r>
-      <w:proofErr w:type="spellEnd"/>
-      <w:r>
-        <w:rPr>
-          <w:b/>
-          <w:bCs/>
-          <w:sz w:val="22"/>
-          <w:szCs w:val="22"/>
-        </w:rPr>
-        <w:t xml:space="preserve"> no Apache </w:t>
-      </w:r>
-      <w:proofErr w:type="spellStart"/>
-      <w:r>
-        <w:rPr>
-          <w:b/>
-          <w:bCs/>
-          <w:sz w:val="22"/>
-          <w:szCs w:val="22"/>
-        </w:rPr>
-        <w:t>Tomcat</w:t>
-      </w:r>
-      <w:proofErr w:type="spellEnd"/>
+        <w:t>: Deploy no Apache Tomcat</w:t>
+      </w:r>
     </w:p>
     <w:p>
       <w:pPr>
@@ -5370,31 +4549,7 @@
         </w:numPr>
       </w:pPr>
       <w:r>
-        <w:t xml:space="preserve">Abra a pasta </w:t>
-      </w:r>
-      <w:proofErr w:type="spellStart"/>
-      <w:r>
-        <w:t>raíz</w:t>
-      </w:r>
-      <w:proofErr w:type="spellEnd"/>
-      <w:r>
-        <w:t xml:space="preserve"> do </w:t>
-      </w:r>
-      <w:proofErr w:type="spellStart"/>
-      <w:r>
-        <w:t>Tomcat</w:t>
-      </w:r>
-      <w:proofErr w:type="spellEnd"/>
-      <w:r>
-        <w:t xml:space="preserve"> e abra a pasta “</w:t>
-      </w:r>
-      <w:proofErr w:type="spellStart"/>
-      <w:r>
-        <w:t>webapps</w:t>
-      </w:r>
-      <w:proofErr w:type="spellEnd"/>
-      <w:r>
-        <w:t>”</w:t>
+        <w:t>Abra a pasta raíz do Tomcat e abra a pasta “webapps”</w:t>
       </w:r>
     </w:p>
     <w:p>
@@ -5411,31 +4566,7 @@
         <w:t xml:space="preserve"> “inst360.war”</w:t>
       </w:r>
       <w:r>
-        <w:t xml:space="preserve"> dentro do diretório </w:t>
-      </w:r>
-      <w:proofErr w:type="spellStart"/>
-      <w:r>
-        <w:t>webapps</w:t>
-      </w:r>
-      <w:proofErr w:type="spellEnd"/>
-      <w:r>
-        <w:t xml:space="preserve"> da instalação do seu </w:t>
-      </w:r>
-      <w:proofErr w:type="spellStart"/>
-      <w:r>
-        <w:t>Tomcat</w:t>
-      </w:r>
-      <w:proofErr w:type="spellEnd"/>
-      <w:r>
-        <w:t xml:space="preserve"> (</w:t>
-      </w:r>
-      <w:proofErr w:type="spellStart"/>
-      <w:r>
-        <w:t>Ex</w:t>
-      </w:r>
-      <w:proofErr w:type="spellEnd"/>
-      <w:r>
-        <w:t>: C:\apache-tomcat-10.x\webapps\).</w:t>
+        <w:t xml:space="preserve"> dentro do diretório webapps da instalação do seu Tomcat (Ex: C:\apache-tomcat-10.x\webapps\).</w:t>
       </w:r>
     </w:p>
     <w:p>
@@ -5446,15 +4577,7 @@
         </w:numPr>
       </w:pPr>
       <w:r>
-        <w:t xml:space="preserve">Acesse a pasta bin do </w:t>
-      </w:r>
-      <w:proofErr w:type="spellStart"/>
-      <w:r>
-        <w:t>Tomcat</w:t>
-      </w:r>
-      <w:proofErr w:type="spellEnd"/>
-      <w:r>
-        <w:t xml:space="preserve"> (C:\apache-tomcat-10.x\bin\) e dê um duplo clique no arquivo startup.bat para iniciar o servidor.</w:t>
+        <w:t>Acesse a pasta bin do Tomcat (C:\apache-tomcat-10.x\bin\) e dê um duplo clique no arquivo startup.bat para iniciar o servidor.</w:t>
       </w:r>
     </w:p>
     <w:p/>
@@ -5614,43 +4737,7 @@
           <w:sz w:val="22"/>
           <w:szCs w:val="22"/>
         </w:rPr>
-        <w:t xml:space="preserve">Infraestrutura e Software: Monitoramento de uso de CPU/Memória do </w:t>
-      </w:r>
-      <w:proofErr w:type="spellStart"/>
-      <w:r>
-        <w:rPr>
-          <w:color w:val="auto"/>
-          <w:sz w:val="22"/>
-          <w:szCs w:val="22"/>
-        </w:rPr>
-        <w:t>Tomcat</w:t>
-      </w:r>
-      <w:proofErr w:type="spellEnd"/>
-      <w:r>
-        <w:rPr>
-          <w:color w:val="auto"/>
-          <w:sz w:val="22"/>
-          <w:szCs w:val="22"/>
-        </w:rPr>
-        <w:t xml:space="preserve"> e logs de erro (</w:t>
-      </w:r>
-      <w:proofErr w:type="spellStart"/>
-      <w:r>
-        <w:rPr>
-          <w:color w:val="auto"/>
-          <w:sz w:val="22"/>
-          <w:szCs w:val="22"/>
-        </w:rPr>
-        <w:t>catalina.out</w:t>
-      </w:r>
-      <w:proofErr w:type="spellEnd"/>
-      <w:r>
-        <w:rPr>
-          <w:color w:val="auto"/>
-          <w:sz w:val="22"/>
-          <w:szCs w:val="22"/>
-        </w:rPr>
-        <w:t>) durante os primeiros 30 dias.</w:t>
+        <w:t>Infraestrutura e Software: Monitoramento de uso de CPU/Memória do Tomcat e logs de erro (catalina.out) durante os primeiros 30 dias.</w:t>
       </w:r>
       <w:r>
         <w:rPr>
@@ -6102,13 +5189,8 @@
       <w:pStyle w:val="Rodap"/>
       <w:jc w:val="right"/>
     </w:pPr>
-    <w:proofErr w:type="spellStart"/>
     <w:r>
-      <w:t>vs</w:t>
-    </w:r>
-    <w:proofErr w:type="spellEnd"/>
-    <w:r>
-      <w:t xml:space="preserve">: </w:t>
+      <w:t xml:space="preserve">vs: </w:t>
     </w:r>
     <w:fldSimple w:instr=" DOCPROPERTY  &quot;Versão Modelo&quot;  \* MERGEFORMAT ">
       <w:r>
@@ -6204,19 +5286,11 @@
               <w:lang w:val="pt-PT"/>
             </w:rPr>
           </w:pPr>
-          <w:proofErr w:type="spellStart"/>
           <w:r>
             <w:rPr>
               <w:bCs/>
             </w:rPr>
-            <w:t>Nomde</w:t>
-          </w:r>
-          <w:proofErr w:type="spellEnd"/>
-          <w:r>
-            <w:rPr>
-              <w:bCs/>
-            </w:rPr>
-            <w:t xml:space="preserve"> do MF</w:t>
+            <w:t>Nomde do MF</w:t>
           </w:r>
         </w:p>
       </w:tc>
@@ -6260,7 +5334,7 @@
               <v:shape id="_x0000_i1025" type="#_x0000_t75" style="width:61.5pt;height:34.5pt">
                 <v:imagedata r:id="rId1" o:title=""/>
               </v:shape>
-              <o:OLEObject Type="Embed" ProgID="Word.Picture.8" ShapeID="_x0000_i1025" DrawAspect="Content" ObjectID="_1842506336" r:id="rId2"/>
+              <o:OLEObject Type="Embed" ProgID="Word.Picture.8" ShapeID="_x0000_i1025" DrawAspect="Content" ObjectID="_1842507495" r:id="rId2"/>
             </w:object>
           </w:r>
         </w:p>
@@ -9758,6 +8832,7 @@
     <w:sig w:usb0="E0002EFF" w:usb1="C000785B" w:usb2="00000009" w:usb3="00000000" w:csb0="000001FF" w:csb1="00000000"/>
   </w:font>
   <w:font w:name="MS Mincho">
+    <w:altName w:val="ＭＳ 明朝"/>
     <w:panose1 w:val="02020609040205080304"/>
     <w:charset w:val="80"/>
     <w:family w:val="modern"/>
@@ -9824,11 +8899,13 @@
   </w:compat>
   <w:rsids>
     <w:rsidRoot w:val="005055FB"/>
+    <w:rsid w:val="00071029"/>
     <w:rsid w:val="000E30AF"/>
     <w:rsid w:val="005055FB"/>
     <w:rsid w:val="009C5FC4"/>
     <w:rsid w:val="00A179EA"/>
     <w:rsid w:val="00A37874"/>
+    <w:rsid w:val="00B300A0"/>
     <w:rsid w:val="00D531CA"/>
     <w:rsid w:val="00E87FAF"/>
   </w:rsids>

</xml_diff>

<commit_message>
Update INST360 - Guia de Implantação.docx
</commit_message>
<xml_diff>
--- a/5.Implantação/INST360 - Guia de Implantação.docx
+++ b/5.Implantação/INST360 - Guia de Implantação.docx
@@ -4204,8 +4204,18 @@
           <w:color w:val="auto"/>
           <w:lang w:val="en-US"/>
         </w:rPr>
-        <w:t>CREATE TABLE usuarios(</w:t>
-      </w:r>
+        <w:t xml:space="preserve">CREATE TABLE </w:t>
+      </w:r>
+      <w:proofErr w:type="gramStart"/>
+      <w:r>
+        <w:rPr>
+          <w:iCs/>
+          <w:color w:val="auto"/>
+          <w:lang w:val="en-US"/>
+        </w:rPr>
+        <w:t>usuarios(</w:t>
+      </w:r>
+      <w:proofErr w:type="gramEnd"/>
     </w:p>
     <w:p>
       <w:pPr>
@@ -4240,7 +4250,25 @@
           <w:color w:val="auto"/>
           <w:lang w:val="en-US"/>
         </w:rPr>
-        <w:t xml:space="preserve">    nome VARCHAR(100) NOT NULL,</w:t>
+        <w:t xml:space="preserve">    nome </w:t>
+      </w:r>
+      <w:proofErr w:type="gramStart"/>
+      <w:r>
+        <w:rPr>
+          <w:iCs/>
+          <w:color w:val="auto"/>
+          <w:lang w:val="en-US"/>
+        </w:rPr>
+        <w:t>VARCHAR(</w:t>
+      </w:r>
+      <w:proofErr w:type="gramEnd"/>
+      <w:r>
+        <w:rPr>
+          <w:iCs/>
+          <w:color w:val="auto"/>
+          <w:lang w:val="en-US"/>
+        </w:rPr>
+        <w:t>100) NOT NULL,</w:t>
       </w:r>
     </w:p>
     <w:p>
@@ -4258,7 +4286,43 @@
           <w:color w:val="auto"/>
           <w:lang w:val="en-US"/>
         </w:rPr>
-        <w:t xml:space="preserve">    matricula VARCHAR(9) NOT NULL,</w:t>
+        <w:t xml:space="preserve">    </w:t>
+      </w:r>
+      <w:proofErr w:type="gramStart"/>
+      <w:r>
+        <w:rPr>
+          <w:iCs/>
+          <w:color w:val="auto"/>
+          <w:lang w:val="en-US"/>
+        </w:rPr>
+        <w:t>matricula</w:t>
+      </w:r>
+      <w:proofErr w:type="gramEnd"/>
+      <w:r>
+        <w:rPr>
+          <w:iCs/>
+          <w:color w:val="auto"/>
+          <w:lang w:val="en-US"/>
+        </w:rPr>
+        <w:t xml:space="preserve"> </w:t>
+      </w:r>
+      <w:proofErr w:type="gramStart"/>
+      <w:r>
+        <w:rPr>
+          <w:iCs/>
+          <w:color w:val="auto"/>
+          <w:lang w:val="en-US"/>
+        </w:rPr>
+        <w:t>VARCHAR(</w:t>
+      </w:r>
+      <w:proofErr w:type="gramEnd"/>
+      <w:r>
+        <w:rPr>
+          <w:iCs/>
+          <w:color w:val="auto"/>
+          <w:lang w:val="en-US"/>
+        </w:rPr>
+        <w:t>9) NOT NULL,</w:t>
       </w:r>
     </w:p>
     <w:p>
@@ -4267,22 +4331,42 @@
         <w:rPr>
           <w:iCs/>
           <w:color w:val="auto"/>
-        </w:rPr>
-      </w:pPr>
-      <w:r>
-        <w:rPr>
-          <w:iCs/>
-          <w:color w:val="auto"/>
           <w:lang w:val="en-US"/>
         </w:rPr>
+      </w:pPr>
+      <w:r>
+        <w:rPr>
+          <w:iCs/>
+          <w:color w:val="auto"/>
+          <w:lang w:val="en-US"/>
+        </w:rPr>
         <w:t xml:space="preserve">    </w:t>
       </w:r>
       <w:r>
         <w:rPr>
           <w:iCs/>
           <w:color w:val="auto"/>
-        </w:rPr>
-        <w:t>endereco VARCHAR(255),</w:t>
+          <w:lang w:val="en-US"/>
+        </w:rPr>
+        <w:t xml:space="preserve">endereco </w:t>
+      </w:r>
+      <w:proofErr w:type="gramStart"/>
+      <w:r>
+        <w:rPr>
+          <w:iCs/>
+          <w:color w:val="auto"/>
+          <w:lang w:val="en-US"/>
+        </w:rPr>
+        <w:t>VARCHAR(</w:t>
+      </w:r>
+      <w:proofErr w:type="gramEnd"/>
+      <w:r>
+        <w:rPr>
+          <w:iCs/>
+          <w:color w:val="auto"/>
+          <w:lang w:val="en-US"/>
+        </w:rPr>
+        <w:t>255),</w:t>
       </w:r>
     </w:p>
     <w:p>
@@ -4291,12 +4375,14 @@
         <w:rPr>
           <w:iCs/>
           <w:color w:val="auto"/>
-        </w:rPr>
-      </w:pPr>
-      <w:r>
-        <w:rPr>
-          <w:iCs/>
-          <w:color w:val="auto"/>
+          <w:lang w:val="en-US"/>
+        </w:rPr>
+      </w:pPr>
+      <w:r>
+        <w:rPr>
+          <w:iCs/>
+          <w:color w:val="auto"/>
+          <w:lang w:val="en-US"/>
         </w:rPr>
         <w:t xml:space="preserve">    data_nasc DATE,</w:t>
       </w:r>
@@ -4314,6 +4400,7 @@
         <w:rPr>
           <w:iCs/>
           <w:color w:val="auto"/>
+          <w:lang w:val="en-US"/>
         </w:rPr>
         <w:t xml:space="preserve">    </w:t>
       </w:r>
@@ -4323,7 +4410,25 @@
           <w:color w:val="auto"/>
           <w:lang w:val="en-US"/>
         </w:rPr>
-        <w:t>email VARCHAR(150),</w:t>
+        <w:t xml:space="preserve">email </w:t>
+      </w:r>
+      <w:proofErr w:type="gramStart"/>
+      <w:r>
+        <w:rPr>
+          <w:iCs/>
+          <w:color w:val="auto"/>
+          <w:lang w:val="en-US"/>
+        </w:rPr>
+        <w:t>VARCHAR(</w:t>
+      </w:r>
+      <w:proofErr w:type="gramEnd"/>
+      <w:r>
+        <w:rPr>
+          <w:iCs/>
+          <w:color w:val="auto"/>
+          <w:lang w:val="en-US"/>
+        </w:rPr>
+        <w:t>150),</w:t>
       </w:r>
     </w:p>
     <w:p>
@@ -4359,7 +4464,25 @@
           <w:color w:val="auto"/>
           <w:lang w:val="en-US"/>
         </w:rPr>
-        <w:t xml:space="preserve">    senha VARCHAR(255) NOT NULL,</w:t>
+        <w:t xml:space="preserve">    senha </w:t>
+      </w:r>
+      <w:proofErr w:type="gramStart"/>
+      <w:r>
+        <w:rPr>
+          <w:iCs/>
+          <w:color w:val="auto"/>
+          <w:lang w:val="en-US"/>
+        </w:rPr>
+        <w:t>VARCHAR(</w:t>
+      </w:r>
+      <w:proofErr w:type="gramEnd"/>
+      <w:r>
+        <w:rPr>
+          <w:iCs/>
+          <w:color w:val="auto"/>
+          <w:lang w:val="en-US"/>
+        </w:rPr>
+        <w:t>255) NOT NULL,</w:t>
       </w:r>
     </w:p>
     <w:p>
@@ -4378,6 +4501,14 @@
           <w:lang w:val="en-US"/>
         </w:rPr>
         <w:t xml:space="preserve">    usuario_valido BOOLEAN DEFAULT FALSE</w:t>
+      </w:r>
+      <w:r>
+        <w:rPr>
+          <w:iCs/>
+          <w:color w:val="auto"/>
+          <w:lang w:val="en-US"/>
+        </w:rPr>
+        <w:t>,</w:t>
       </w:r>
     </w:p>
     <w:p>
@@ -4933,7 +5064,15 @@
             <w:pStyle w:val="Rodap"/>
           </w:pPr>
           <w:r>
-            <w:t>ITQ- X.X-XX.XX – Nome da ITQ</w:t>
+            <w:t>ITQ- X.X-</w:t>
+          </w:r>
+          <w:proofErr w:type="gramStart"/>
+          <w:r>
+            <w:t>XX.XX</w:t>
+          </w:r>
+          <w:proofErr w:type="gramEnd"/>
+          <w:r>
+            <w:t xml:space="preserve"> – Nome da ITQ</w:t>
           </w:r>
         </w:p>
       </w:tc>
@@ -5334,7 +5473,7 @@
               <v:shape id="_x0000_i1025" type="#_x0000_t75" style="width:61.5pt;height:34.5pt">
                 <v:imagedata r:id="rId1" o:title=""/>
               </v:shape>
-              <o:OLEObject Type="Embed" ProgID="Word.Picture.8" ShapeID="_x0000_i1025" DrawAspect="Content" ObjectID="_1842507495" r:id="rId2"/>
+              <o:OLEObject Type="Embed" ProgID="Word.Picture.8" ShapeID="_x0000_i1025" DrawAspect="Content" ObjectID="_1842518494" r:id="rId2"/>
             </w:object>
           </w:r>
         </w:p>
@@ -8901,6 +9040,8 @@
     <w:rsidRoot w:val="005055FB"/>
     <w:rsid w:val="00071029"/>
     <w:rsid w:val="000E30AF"/>
+    <w:rsid w:val="00321402"/>
+    <w:rsid w:val="00491FAF"/>
     <w:rsid w:val="005055FB"/>
     <w:rsid w:val="009C5FC4"/>
     <w:rsid w:val="00A179EA"/>

</xml_diff>

<commit_message>
Alteração de Guia de Implantação e Guia do Usuário
Realizadas correções pontuais dentro dos documentos.
</commit_message>
<xml_diff>
--- a/5.Implantação/INST360 - Guia de Implantação.docx
+++ b/5.Implantação/INST360 - Guia de Implantação.docx
@@ -1261,7 +1261,15 @@
                 <w:iCs/>
                 <w:color w:val="auto"/>
               </w:rPr>
-              <w:t>Thiago Dionizio</w:t>
+              <w:t xml:space="preserve">Thiago </w:t>
+            </w:r>
+            <w:r>
+              <w:rPr>
+                <w:i w:val="0"/>
+                <w:iCs/>
+                <w:color w:val="auto"/>
+              </w:rPr>
+              <w:t>Marques</w:t>
             </w:r>
           </w:p>
         </w:tc>
@@ -2209,25 +2217,7 @@
           <w:iCs/>
           <w:color w:val="auto"/>
         </w:rPr>
-        <w:t xml:space="preserve">Documento de Arquitetura do Sistema (DAS) - Detalhes do padrão MVC e </w:t>
-      </w:r>
-      <w:proofErr w:type="spellStart"/>
-      <w:r>
-        <w:rPr>
-          <w:i w:val="0"/>
-          <w:iCs/>
-          <w:color w:val="auto"/>
-        </w:rPr>
-        <w:t>Servlets</w:t>
-      </w:r>
-      <w:proofErr w:type="spellEnd"/>
-      <w:r>
-        <w:rPr>
-          <w:i w:val="0"/>
-          <w:iCs/>
-          <w:color w:val="auto"/>
-        </w:rPr>
-        <w:t>.</w:t>
+        <w:t>Documento de Arquitetura do Sistema (DAS) - Detalhes do padrão MVC e Servlets.</w:t>
       </w:r>
     </w:p>
     <w:p>
@@ -2283,43 +2273,7 @@
           <w:iCs/>
           <w:color w:val="auto"/>
         </w:rPr>
-        <w:t>A implantação compreende o empacotamento da aplicação em um arquivo .</w:t>
-      </w:r>
-      <w:proofErr w:type="spellStart"/>
-      <w:r>
-        <w:rPr>
-          <w:i w:val="0"/>
-          <w:iCs/>
-          <w:color w:val="auto"/>
-        </w:rPr>
-        <w:t>war</w:t>
-      </w:r>
-      <w:proofErr w:type="spellEnd"/>
-      <w:r>
-        <w:rPr>
-          <w:i w:val="0"/>
-          <w:iCs/>
-          <w:color w:val="auto"/>
-        </w:rPr>
-        <w:t xml:space="preserve">, a preparação do servidor de banco de dados, a configuração do servidor de aplicação </w:t>
-      </w:r>
-      <w:proofErr w:type="spellStart"/>
-      <w:r>
-        <w:rPr>
-          <w:i w:val="0"/>
-          <w:iCs/>
-          <w:color w:val="auto"/>
-        </w:rPr>
-        <w:t>Tomcat</w:t>
-      </w:r>
-      <w:proofErr w:type="spellEnd"/>
-      <w:r>
-        <w:rPr>
-          <w:i w:val="0"/>
-          <w:iCs/>
-          <w:color w:val="auto"/>
-        </w:rPr>
-        <w:t xml:space="preserve"> e a homologação final junto ao cliente.</w:t>
+        <w:t>A implantação compreende o empacotamento da aplicação em um arquivo .war, a preparação do servidor de banco de dados, a configuração do servidor de aplicação Tomcat e a homologação final junto ao cliente.</w:t>
       </w:r>
     </w:p>
     <w:p>
@@ -2501,45 +2455,8 @@
           <w:sz w:val="22"/>
           <w:szCs w:val="22"/>
         </w:rPr>
-        <w:t>Geração do arquivo .</w:t>
-      </w:r>
-      <w:proofErr w:type="spellStart"/>
-      <w:r>
-        <w:rPr>
-          <w:b/>
-          <w:bCs/>
-          <w:iCs/>
-          <w:color w:val="auto"/>
-          <w:sz w:val="22"/>
-          <w:szCs w:val="22"/>
-        </w:rPr>
-        <w:t>war</w:t>
-      </w:r>
-      <w:proofErr w:type="spellEnd"/>
-      <w:r>
-        <w:rPr>
-          <w:b/>
-          <w:bCs/>
-          <w:iCs/>
-          <w:color w:val="auto"/>
-          <w:sz w:val="22"/>
-          <w:szCs w:val="22"/>
-        </w:rPr>
-        <w:t xml:space="preserve"> e </w:t>
-      </w:r>
-      <w:proofErr w:type="spellStart"/>
-      <w:r>
-        <w:rPr>
-          <w:b/>
-          <w:bCs/>
-          <w:iCs/>
-          <w:color w:val="auto"/>
-          <w:sz w:val="22"/>
-          <w:szCs w:val="22"/>
-        </w:rPr>
-        <w:t>Deploy</w:t>
-      </w:r>
-      <w:proofErr w:type="spellEnd"/>
+        <w:t>Geração do arquivo .war e Deploy</w:t>
+      </w:r>
       <w:r>
         <w:rPr>
           <w:b/>
@@ -2814,29 +2731,7 @@
           <w:sz w:val="22"/>
           <w:szCs w:val="22"/>
         </w:rPr>
-        <w:t xml:space="preserve"> A aplicação rodará localmente (</w:t>
-      </w:r>
-      <w:proofErr w:type="spellStart"/>
-      <w:r>
-        <w:rPr>
-          <w:i w:val="0"/>
-          <w:iCs/>
-          <w:color w:val="auto"/>
-          <w:sz w:val="22"/>
-          <w:szCs w:val="22"/>
-        </w:rPr>
-        <w:t>localhost</w:t>
-      </w:r>
-      <w:proofErr w:type="spellEnd"/>
-      <w:r>
-        <w:rPr>
-          <w:i w:val="0"/>
-          <w:iCs/>
-          <w:color w:val="auto"/>
-          <w:sz w:val="22"/>
-          <w:szCs w:val="22"/>
-        </w:rPr>
-        <w:t xml:space="preserve">), dispensando a necessidade de </w:t>
+        <w:t xml:space="preserve"> A aplicação rodará localmente (localhost), dispensando a necessidade de </w:t>
       </w:r>
     </w:p>
     <w:p>
@@ -3092,29 +2987,7 @@
           <w:sz w:val="22"/>
           <w:szCs w:val="22"/>
         </w:rPr>
-        <w:t xml:space="preserve"> Apache </w:t>
-      </w:r>
-      <w:proofErr w:type="spellStart"/>
-      <w:r>
-        <w:rPr>
-          <w:i w:val="0"/>
-          <w:iCs/>
-          <w:color w:val="auto"/>
-          <w:sz w:val="22"/>
-          <w:szCs w:val="22"/>
-        </w:rPr>
-        <w:t>Tomcat</w:t>
-      </w:r>
-      <w:proofErr w:type="spellEnd"/>
-      <w:r>
-        <w:rPr>
-          <w:i w:val="0"/>
-          <w:iCs/>
-          <w:color w:val="auto"/>
-          <w:sz w:val="22"/>
-          <w:szCs w:val="22"/>
-        </w:rPr>
-        <w:t xml:space="preserve"> 10.x instalado localmente (Fabricante: Apache Software Foundation / Licença: Gratuita/Código Aberto).</w:t>
+        <w:t xml:space="preserve"> Apache Tomcat 10.x instalado localmente (Fabricante: Apache Software Foundation / Licença: Gratuita/Código Aberto).</w:t>
       </w:r>
     </w:p>
     <w:p/>
@@ -3149,9 +3022,8 @@
           <w:sz w:val="22"/>
           <w:szCs w:val="22"/>
         </w:rPr>
-        <w:t xml:space="preserve"> Java </w:t>
-      </w:r>
-      <w:proofErr w:type="spellStart"/>
+        <w:t xml:space="preserve"> Java Development Kit (JDK) </w:t>
+      </w:r>
       <w:r>
         <w:rPr>
           <w:i w:val="0"/>
@@ -3160,9 +3032,8 @@
           <w:sz w:val="22"/>
           <w:szCs w:val="22"/>
         </w:rPr>
-        <w:t>Development</w:t>
-      </w:r>
-      <w:proofErr w:type="spellEnd"/>
+        <w:t xml:space="preserve">21 </w:t>
+      </w:r>
       <w:r>
         <w:rPr>
           <w:i w:val="0"/>
@@ -3171,71 +3042,7 @@
           <w:sz w:val="22"/>
           <w:szCs w:val="22"/>
         </w:rPr>
-        <w:t xml:space="preserve"> Kit (JDK) </w:t>
-      </w:r>
-      <w:r>
-        <w:rPr>
-          <w:i w:val="0"/>
-          <w:iCs/>
-          <w:color w:val="auto"/>
-          <w:sz w:val="22"/>
-          <w:szCs w:val="22"/>
-        </w:rPr>
-        <w:t xml:space="preserve">21 </w:t>
-      </w:r>
-      <w:r>
-        <w:rPr>
-          <w:i w:val="0"/>
-          <w:iCs/>
-          <w:color w:val="auto"/>
-          <w:sz w:val="22"/>
-          <w:szCs w:val="22"/>
-        </w:rPr>
-        <w:t xml:space="preserve">ou Java </w:t>
-      </w:r>
-      <w:proofErr w:type="spellStart"/>
-      <w:r>
-        <w:rPr>
-          <w:i w:val="0"/>
-          <w:iCs/>
-          <w:color w:val="auto"/>
-          <w:sz w:val="22"/>
-          <w:szCs w:val="22"/>
-        </w:rPr>
-        <w:t>Runtime</w:t>
-      </w:r>
-      <w:proofErr w:type="spellEnd"/>
-      <w:r>
-        <w:rPr>
-          <w:i w:val="0"/>
-          <w:iCs/>
-          <w:color w:val="auto"/>
-          <w:sz w:val="22"/>
-          <w:szCs w:val="22"/>
-        </w:rPr>
-        <w:t xml:space="preserve"> </w:t>
-      </w:r>
-      <w:proofErr w:type="spellStart"/>
-      <w:r>
-        <w:rPr>
-          <w:i w:val="0"/>
-          <w:iCs/>
-          <w:color w:val="auto"/>
-          <w:sz w:val="22"/>
-          <w:szCs w:val="22"/>
-        </w:rPr>
-        <w:t>Environment</w:t>
-      </w:r>
-      <w:proofErr w:type="spellEnd"/>
-      <w:r>
-        <w:rPr>
-          <w:i w:val="0"/>
-          <w:iCs/>
-          <w:color w:val="auto"/>
-          <w:sz w:val="22"/>
-          <w:szCs w:val="22"/>
-        </w:rPr>
-        <w:t xml:space="preserve"> (JRE) instalado e configurado nas variáveis de ambiente do Windows (Licença: Gratuita para fins acadêmicos/desenvolvimento).</w:t>
+        <w:t>ou Java Runtime Environment (JRE) instalado e configurado nas variáveis de ambiente do Windows (Licença: Gratuita para fins acadêmicos/desenvolvimento).</w:t>
       </w:r>
     </w:p>
     <w:p/>
@@ -3260,23 +3067,7 @@
           <w:sz w:val="22"/>
           <w:szCs w:val="22"/>
         </w:rPr>
-        <w:t xml:space="preserve"> Apache </w:t>
-      </w:r>
-      <w:proofErr w:type="spellStart"/>
-      <w:r>
-        <w:rPr>
-          <w:sz w:val="22"/>
-          <w:szCs w:val="22"/>
-        </w:rPr>
-        <w:t>Maven</w:t>
-      </w:r>
-      <w:proofErr w:type="spellEnd"/>
-      <w:r>
-        <w:rPr>
-          <w:sz w:val="22"/>
-          <w:szCs w:val="22"/>
-        </w:rPr>
-        <w:t xml:space="preserve"> 3.9.x (Fabricante: Apache Software Foundation / Licença: Gratuita/Código Aberto).</w:t>
+        <w:t xml:space="preserve"> Apache Maven 3.9.x (Fabricante: Apache Software Foundation / Licença: Gratuita/Código Aberto).</w:t>
       </w:r>
     </w:p>
     <w:p/>
@@ -3311,95 +3102,7 @@
           <w:sz w:val="22"/>
           <w:szCs w:val="22"/>
         </w:rPr>
-        <w:t xml:space="preserve"> PostgreSQL 15 (ou superior) instalado localmente ou via ferramenta </w:t>
-      </w:r>
-      <w:proofErr w:type="spellStart"/>
-      <w:r>
-        <w:rPr>
-          <w:i w:val="0"/>
-          <w:iCs/>
-          <w:color w:val="auto"/>
-          <w:sz w:val="22"/>
-          <w:szCs w:val="22"/>
-        </w:rPr>
-        <w:t>pgAdmin</w:t>
-      </w:r>
-      <w:proofErr w:type="spellEnd"/>
-      <w:r>
-        <w:rPr>
-          <w:i w:val="0"/>
-          <w:iCs/>
-          <w:color w:val="auto"/>
-          <w:sz w:val="22"/>
-          <w:szCs w:val="22"/>
-        </w:rPr>
-        <w:t xml:space="preserve"> 4 (Fabricante: PostgreSQL Global </w:t>
-      </w:r>
-      <w:proofErr w:type="spellStart"/>
-      <w:r>
-        <w:rPr>
-          <w:i w:val="0"/>
-          <w:iCs/>
-          <w:color w:val="auto"/>
-          <w:sz w:val="22"/>
-          <w:szCs w:val="22"/>
-        </w:rPr>
-        <w:t>Development</w:t>
-      </w:r>
-      <w:proofErr w:type="spellEnd"/>
-      <w:r>
-        <w:rPr>
-          <w:i w:val="0"/>
-          <w:iCs/>
-          <w:color w:val="auto"/>
-          <w:sz w:val="22"/>
-          <w:szCs w:val="22"/>
-        </w:rPr>
-        <w:t xml:space="preserve"> </w:t>
-      </w:r>
-      <w:proofErr w:type="spellStart"/>
-      <w:r>
-        <w:rPr>
-          <w:i w:val="0"/>
-          <w:iCs/>
-          <w:color w:val="auto"/>
-          <w:sz w:val="22"/>
-          <w:szCs w:val="22"/>
-        </w:rPr>
-        <w:t>Group</w:t>
-      </w:r>
-      <w:proofErr w:type="spellEnd"/>
-      <w:r>
-        <w:rPr>
-          <w:i w:val="0"/>
-          <w:iCs/>
-          <w:color w:val="auto"/>
-          <w:sz w:val="22"/>
-          <w:szCs w:val="22"/>
-        </w:rPr>
-        <w:t xml:space="preserve"> / Licença: Gratuita/Código Aberto - PostgreSQL </w:t>
-      </w:r>
-      <w:proofErr w:type="spellStart"/>
-      <w:r>
-        <w:rPr>
-          <w:i w:val="0"/>
-          <w:iCs/>
-          <w:color w:val="auto"/>
-          <w:sz w:val="22"/>
-          <w:szCs w:val="22"/>
-        </w:rPr>
-        <w:t>License</w:t>
-      </w:r>
-      <w:proofErr w:type="spellEnd"/>
-      <w:r>
-        <w:rPr>
-          <w:i w:val="0"/>
-          <w:iCs/>
-          <w:color w:val="auto"/>
-          <w:sz w:val="22"/>
-          <w:szCs w:val="22"/>
-        </w:rPr>
-        <w:t>).</w:t>
+        <w:t xml:space="preserve"> PostgreSQL 15 (ou superior) instalado localmente ou via ferramenta pgAdmin 4 (Fabricante: PostgreSQL Global Development Group / Licença: Gratuita/Código Aberto - PostgreSQL License).</w:t>
       </w:r>
     </w:p>
     <w:p/>
@@ -3489,29 +3192,7 @@
           <w:sz w:val="22"/>
           <w:szCs w:val="22"/>
         </w:rPr>
-        <w:t xml:space="preserve"> Responsável por iniciar o banco de dados local, iniciar o servidor </w:t>
-      </w:r>
-      <w:proofErr w:type="spellStart"/>
-      <w:r>
-        <w:rPr>
-          <w:i w:val="0"/>
-          <w:iCs/>
-          <w:color w:val="auto"/>
-          <w:sz w:val="22"/>
-          <w:szCs w:val="22"/>
-        </w:rPr>
-        <w:t>Tomcat</w:t>
-      </w:r>
-      <w:proofErr w:type="spellEnd"/>
-      <w:r>
-        <w:rPr>
-          <w:i w:val="0"/>
-          <w:iCs/>
-          <w:color w:val="auto"/>
-          <w:sz w:val="22"/>
-          <w:szCs w:val="22"/>
-        </w:rPr>
-        <w:t xml:space="preserve"> e projetar a tela do sistema.</w:t>
+        <w:t xml:space="preserve"> Responsável por iniciar o banco de dados local, iniciar o servidor Tomcat e projetar a tela do sistema.</w:t>
       </w:r>
     </w:p>
     <w:p/>
@@ -3914,21 +3595,7 @@
         <w:rPr>
           <w:lang w:eastAsia="en-US"/>
         </w:rPr>
-        <w:t>Valor da variável: O caminho da pasta do JDK (</w:t>
-      </w:r>
-      <w:proofErr w:type="spellStart"/>
-      <w:r>
-        <w:rPr>
-          <w:lang w:eastAsia="en-US"/>
-        </w:rPr>
-        <w:t>Ex</w:t>
-      </w:r>
-      <w:proofErr w:type="spellEnd"/>
-      <w:r>
-        <w:rPr>
-          <w:lang w:eastAsia="en-US"/>
-        </w:rPr>
-        <w:t>: C:\Program Files\Java\jdk-17).</w:t>
+        <w:t>Valor da variável: O caminho da pasta do JDK (Ex: C:\Program Files\Java\jdk-17).</w:t>
       </w:r>
     </w:p>
     <w:p>
@@ -4076,29 +3743,7 @@
           <w:szCs w:val="22"/>
           <w:lang w:eastAsia="en-US"/>
         </w:rPr>
-        <w:t xml:space="preserve">: Configuração do </w:t>
-      </w:r>
-      <w:proofErr w:type="spellStart"/>
-      <w:r>
-        <w:rPr>
-          <w:b/>
-          <w:bCs/>
-          <w:sz w:val="22"/>
-          <w:szCs w:val="22"/>
-          <w:lang w:eastAsia="en-US"/>
-        </w:rPr>
-        <w:t>Maven</w:t>
-      </w:r>
-      <w:proofErr w:type="spellEnd"/>
-      <w:r>
-        <w:rPr>
-          <w:b/>
-          <w:bCs/>
-          <w:sz w:val="22"/>
-          <w:szCs w:val="22"/>
-          <w:lang w:eastAsia="en-US"/>
-        </w:rPr>
-        <w:t xml:space="preserve"> nas Variáveis de Ambiente</w:t>
+        <w:t>: Configuração do Maven nas Variáveis de Ambiente</w:t>
       </w:r>
     </w:p>
     <w:p>
@@ -4124,35 +3769,30 @@
         <w:rPr>
           <w:lang w:eastAsia="en-US"/>
         </w:rPr>
-        <w:t xml:space="preserve">Extraia o arquivo .zip do Apache </w:t>
-      </w:r>
-      <w:proofErr w:type="spellStart"/>
+        <w:t xml:space="preserve">Baixe o Maven em </w:t>
+      </w:r>
       <w:r>
         <w:rPr>
           <w:lang w:eastAsia="en-US"/>
         </w:rPr>
-        <w:t>Maven</w:t>
-      </w:r>
-      <w:proofErr w:type="spellEnd"/>
-      <w:r>
+        <w:t>https://maven.apache.org/download.cgi</w:t>
+      </w:r>
+    </w:p>
+    <w:p>
+      <w:pPr>
+        <w:numPr>
+          <w:ilvl w:val="0"/>
+          <w:numId w:val="20"/>
+        </w:numPr>
         <w:rPr>
           <w:lang w:eastAsia="en-US"/>
         </w:rPr>
-        <w:t xml:space="preserve"> em uma pasta de sua preferência (</w:t>
-      </w:r>
-      <w:proofErr w:type="spellStart"/>
+      </w:pPr>
       <w:r>
         <w:rPr>
           <w:lang w:eastAsia="en-US"/>
         </w:rPr>
-        <w:t>Ex</w:t>
-      </w:r>
-      <w:proofErr w:type="spellEnd"/>
-      <w:r>
-        <w:rPr>
-          <w:lang w:eastAsia="en-US"/>
-        </w:rPr>
-        <w:t>: C:\apache-maven-3.9.x).</w:t>
+        <w:t>Extraia o arquivo .zip do Apache Maven em uma pasta de sua preferência (Ex: C:\apache-maven-3.9.x).</w:t>
       </w:r>
     </w:p>
     <w:p>
@@ -4236,35 +3876,7 @@
         <w:rPr>
           <w:lang w:eastAsia="en-US"/>
         </w:rPr>
-        <w:t xml:space="preserve">Valor da variável: O caminho da pasta do </w:t>
-      </w:r>
-      <w:proofErr w:type="spellStart"/>
-      <w:r>
-        <w:rPr>
-          <w:lang w:eastAsia="en-US"/>
-        </w:rPr>
-        <w:t>Maven</w:t>
-      </w:r>
-      <w:proofErr w:type="spellEnd"/>
-      <w:r>
-        <w:rPr>
-          <w:lang w:eastAsia="en-US"/>
-        </w:rPr>
-        <w:t xml:space="preserve"> (</w:t>
-      </w:r>
-      <w:proofErr w:type="spellStart"/>
-      <w:r>
-        <w:rPr>
-          <w:lang w:eastAsia="en-US"/>
-        </w:rPr>
-        <w:t>Ex</w:t>
-      </w:r>
-      <w:proofErr w:type="spellEnd"/>
-      <w:r>
-        <w:rPr>
-          <w:lang w:eastAsia="en-US"/>
-        </w:rPr>
-        <w:t>: C:\apache-maven-3.9.x).</w:t>
+        <w:t>Valor da variável: O caminho da pasta do Maven (Ex: C:\apache-maven-3.9.x).</w:t>
       </w:r>
     </w:p>
     <w:p>
@@ -4436,7 +4048,6 @@
         </w:rPr>
         <w:t xml:space="preserve">Abra a ferramenta </w:t>
       </w:r>
-      <w:proofErr w:type="spellStart"/>
       <w:r>
         <w:rPr>
           <w:b/>
@@ -4444,17 +4055,7 @@
           <w:iCs/>
           <w:color w:val="auto"/>
         </w:rPr>
-        <w:t>pgAdmin</w:t>
-      </w:r>
-      <w:proofErr w:type="spellEnd"/>
-      <w:r>
-        <w:rPr>
-          <w:b/>
-          <w:bCs/>
-          <w:iCs/>
-          <w:color w:val="auto"/>
-        </w:rPr>
-        <w:t xml:space="preserve"> 4</w:t>
+        <w:t>pgAdmin 4</w:t>
       </w:r>
       <w:r>
         <w:rPr>
@@ -4480,39 +4081,7 @@
           <w:iCs/>
           <w:color w:val="auto"/>
         </w:rPr>
-        <w:t xml:space="preserve">Conecte-se ao servidor local, clique com o botão direito em </w:t>
-      </w:r>
-      <w:proofErr w:type="spellStart"/>
-      <w:r>
-        <w:rPr>
-          <w:iCs/>
-          <w:color w:val="auto"/>
-        </w:rPr>
-        <w:t>Databases</w:t>
-      </w:r>
-      <w:proofErr w:type="spellEnd"/>
-      <w:r>
-        <w:rPr>
-          <w:iCs/>
-          <w:color w:val="auto"/>
-        </w:rPr>
-        <w:t xml:space="preserve"> e selecione </w:t>
-      </w:r>
-      <w:proofErr w:type="spellStart"/>
-      <w:r>
-        <w:rPr>
-          <w:iCs/>
-          <w:color w:val="auto"/>
-        </w:rPr>
-        <w:t>Create</w:t>
-      </w:r>
-      <w:proofErr w:type="spellEnd"/>
-      <w:r>
-        <w:rPr>
-          <w:iCs/>
-          <w:color w:val="auto"/>
-        </w:rPr>
-        <w:t xml:space="preserve"> </w:t>
+        <w:t xml:space="preserve">Conecte-se ao servidor local, clique com o botão direito em Databases e selecione Create </w:t>
       </w:r>
       <w:r>
         <w:rPr>
@@ -4526,23 +4095,7 @@
           <w:iCs/>
           <w:color w:val="auto"/>
         </w:rPr>
-        <w:t xml:space="preserve">&gt; </w:t>
-      </w:r>
-      <w:proofErr w:type="spellStart"/>
-      <w:r>
-        <w:rPr>
-          <w:iCs/>
-          <w:color w:val="auto"/>
-        </w:rPr>
-        <w:t>Database</w:t>
-      </w:r>
-      <w:proofErr w:type="spellEnd"/>
-      <w:r>
-        <w:rPr>
-          <w:iCs/>
-          <w:color w:val="auto"/>
-        </w:rPr>
-        <w:t>....</w:t>
+        <w:t>&gt; Database....</w:t>
       </w:r>
     </w:p>
     <w:p>
@@ -4682,28 +4235,26 @@
           <w:color w:val="auto"/>
           <w:lang w:val="en-US"/>
         </w:rPr>
-        <w:t xml:space="preserve">CREATE TABLE </w:t>
-      </w:r>
-      <w:proofErr w:type="spellStart"/>
-      <w:proofErr w:type="gramStart"/>
-      <w:r>
+        <w:t>CREATE TABLE usuarios(</w:t>
+      </w:r>
+    </w:p>
+    <w:p>
+      <w:pPr>
+        <w:ind w:left="708"/>
         <w:rPr>
           <w:iCs/>
           <w:color w:val="auto"/>
           <w:lang w:val="en-US"/>
         </w:rPr>
-        <w:t>usuarios</w:t>
-      </w:r>
-      <w:proofErr w:type="spellEnd"/>
+      </w:pPr>
       <w:r>
         <w:rPr>
           <w:iCs/>
           <w:color w:val="auto"/>
           <w:lang w:val="en-US"/>
         </w:rPr>
-        <w:t>(</w:t>
-      </w:r>
-      <w:proofErr w:type="gramEnd"/>
+        <w:t xml:space="preserve">    id SERIAL PRIMARY KEY,</w:t>
+      </w:r>
     </w:p>
     <w:p>
       <w:pPr>
@@ -4720,7 +4271,7 @@
           <w:color w:val="auto"/>
           <w:lang w:val="en-US"/>
         </w:rPr>
-        <w:t xml:space="preserve">    id SERIAL PRIMARY KEY,</w:t>
+        <w:t xml:space="preserve">    nome VARCHAR(100) NOT NULL,</w:t>
       </w:r>
     </w:p>
     <w:p>
@@ -4738,546 +4289,197 @@
           <w:color w:val="auto"/>
           <w:lang w:val="en-US"/>
         </w:rPr>
+        <w:t xml:space="preserve">    matricula VARCHAR(9) NOT NULL,</w:t>
+      </w:r>
+    </w:p>
+    <w:p>
+      <w:pPr>
+        <w:ind w:left="708"/>
+        <w:rPr>
+          <w:iCs/>
+          <w:color w:val="auto"/>
+        </w:rPr>
+      </w:pPr>
+      <w:r>
+        <w:rPr>
+          <w:iCs/>
+          <w:color w:val="auto"/>
+          <w:lang w:val="en-US"/>
+        </w:rPr>
         <w:t xml:space="preserve">    </w:t>
       </w:r>
-      <w:proofErr w:type="spellStart"/>
-      <w:r>
+      <w:r>
+        <w:rPr>
+          <w:iCs/>
+          <w:color w:val="auto"/>
+        </w:rPr>
+        <w:t>endereco VARCHAR(255),</w:t>
+      </w:r>
+    </w:p>
+    <w:p>
+      <w:pPr>
+        <w:ind w:left="708"/>
+        <w:rPr>
+          <w:iCs/>
+          <w:color w:val="auto"/>
+        </w:rPr>
+      </w:pPr>
+      <w:r>
+        <w:rPr>
+          <w:iCs/>
+          <w:color w:val="auto"/>
+        </w:rPr>
+        <w:t xml:space="preserve">    data_nasc DATE,</w:t>
+      </w:r>
+    </w:p>
+    <w:p>
+      <w:pPr>
+        <w:ind w:left="708"/>
         <w:rPr>
           <w:iCs/>
           <w:color w:val="auto"/>
           <w:lang w:val="en-US"/>
         </w:rPr>
-        <w:t>nome</w:t>
-      </w:r>
-      <w:proofErr w:type="spellEnd"/>
+      </w:pPr>
+      <w:r>
+        <w:rPr>
+          <w:iCs/>
+          <w:color w:val="auto"/>
+        </w:rPr>
+        <w:t xml:space="preserve">    </w:t>
+      </w:r>
       <w:r>
         <w:rPr>
           <w:iCs/>
           <w:color w:val="auto"/>
           <w:lang w:val="en-US"/>
         </w:rPr>
+        <w:t>email VARCHAR(150),</w:t>
+      </w:r>
+    </w:p>
+    <w:p>
+      <w:pPr>
+        <w:ind w:left="708"/>
+        <w:rPr>
+          <w:iCs/>
+          <w:color w:val="auto"/>
+          <w:lang w:val="en-US"/>
+        </w:rPr>
+      </w:pPr>
+      <w:r>
+        <w:rPr>
+          <w:iCs/>
+          <w:color w:val="auto"/>
+          <w:lang w:val="en-US"/>
+        </w:rPr>
+        <w:t xml:space="preserve">    data_cad TIMESTAMP DEFAULT CURRENT_TIMESTAMP,</w:t>
+      </w:r>
+    </w:p>
+    <w:p>
+      <w:pPr>
+        <w:ind w:left="708"/>
+        <w:rPr>
+          <w:iCs/>
+          <w:color w:val="auto"/>
+          <w:lang w:val="en-US"/>
+        </w:rPr>
+      </w:pPr>
+      <w:r>
+        <w:rPr>
+          <w:iCs/>
+          <w:color w:val="auto"/>
+          <w:lang w:val="en-US"/>
+        </w:rPr>
+        <w:t xml:space="preserve">    senha VARCHAR(255) NOT NULL,</w:t>
+      </w:r>
+    </w:p>
+    <w:p>
+      <w:pPr>
+        <w:ind w:left="708"/>
+        <w:rPr>
+          <w:iCs/>
+          <w:color w:val="auto"/>
+          <w:lang w:val="en-US"/>
+        </w:rPr>
+      </w:pPr>
+      <w:r>
+        <w:rPr>
+          <w:iCs/>
+          <w:color w:val="auto"/>
+          <w:lang w:val="en-US"/>
+        </w:rPr>
+        <w:t xml:space="preserve">    usuario_valido BOOLEAN DEFAULT FALSE</w:t>
+      </w:r>
+      <w:r>
+        <w:rPr>
+          <w:iCs/>
+          <w:color w:val="auto"/>
+          <w:lang w:val="en-US"/>
+        </w:rPr>
+        <w:t>,</w:t>
+      </w:r>
+    </w:p>
+    <w:p>
+      <w:pPr>
+        <w:ind w:left="708"/>
+        <w:rPr>
+          <w:iCs/>
+          <w:color w:val="auto"/>
+        </w:rPr>
+      </w:pPr>
+      <w:r>
+        <w:rPr>
+          <w:iCs/>
+          <w:color w:val="auto"/>
+          <w:lang w:val="en-US"/>
+        </w:rPr>
+        <w:t xml:space="preserve">    </w:t>
+      </w:r>
+      <w:r>
+        <w:rPr>
+          <w:iCs/>
+          <w:color w:val="auto"/>
+        </w:rPr>
+        <w:t>administrador BOOLEAN DEFAULT FALSE);</w:t>
+      </w:r>
+    </w:p>
+    <w:p>
+      <w:pPr>
+        <w:ind w:left="708"/>
+        <w:rPr>
+          <w:iCs/>
+          <w:color w:val="auto"/>
+        </w:rPr>
+      </w:pPr>
+    </w:p>
+    <w:p>
+      <w:pPr>
+        <w:ind w:left="708"/>
+        <w:rPr>
+          <w:iCs/>
+          <w:color w:val="auto"/>
+        </w:rPr>
+      </w:pPr>
+      <w:r>
+        <w:rPr>
+          <w:iCs/>
+          <w:color w:val="auto"/>
+        </w:rPr>
+        <w:t>INSERT INTO usuarios (id, nome, matricula, endereco, data_nasc, email, senha, usuario_valido, administrador)</w:t>
+      </w:r>
+      <w:r>
+        <w:rPr>
+          <w:iCs/>
+          <w:color w:val="auto"/>
+        </w:rPr>
         <w:t xml:space="preserve"> </w:t>
       </w:r>
-      <w:proofErr w:type="gramStart"/>
-      <w:r>
-        <w:rPr>
-          <w:iCs/>
-          <w:color w:val="auto"/>
-          <w:lang w:val="en-US"/>
-        </w:rPr>
-        <w:t>VARCHAR(</w:t>
-      </w:r>
-      <w:proofErr w:type="gramEnd"/>
-      <w:r>
-        <w:rPr>
-          <w:iCs/>
-          <w:color w:val="auto"/>
-          <w:lang w:val="en-US"/>
-        </w:rPr>
-        <w:t>100) NOT NULL,</w:t>
-      </w:r>
-    </w:p>
-    <w:p>
-      <w:pPr>
-        <w:ind w:left="708"/>
-        <w:rPr>
-          <w:iCs/>
-          <w:color w:val="auto"/>
-          <w:lang w:val="en-US"/>
-        </w:rPr>
-      </w:pPr>
-      <w:r>
-        <w:rPr>
-          <w:iCs/>
-          <w:color w:val="auto"/>
-          <w:lang w:val="en-US"/>
-        </w:rPr>
-        <w:t xml:space="preserve">    </w:t>
-      </w:r>
-      <w:proofErr w:type="gramStart"/>
-      <w:r>
-        <w:rPr>
-          <w:iCs/>
-          <w:color w:val="auto"/>
-          <w:lang w:val="en-US"/>
-        </w:rPr>
-        <w:t>matricula</w:t>
-      </w:r>
-      <w:proofErr w:type="gramEnd"/>
-      <w:r>
-        <w:rPr>
-          <w:iCs/>
-          <w:color w:val="auto"/>
-          <w:lang w:val="en-US"/>
-        </w:rPr>
-        <w:t xml:space="preserve"> </w:t>
-      </w:r>
-      <w:proofErr w:type="gramStart"/>
-      <w:r>
-        <w:rPr>
-          <w:iCs/>
-          <w:color w:val="auto"/>
-          <w:lang w:val="en-US"/>
-        </w:rPr>
-        <w:t>VARCHAR(</w:t>
-      </w:r>
-      <w:proofErr w:type="gramEnd"/>
-      <w:r>
-        <w:rPr>
-          <w:iCs/>
-          <w:color w:val="auto"/>
-          <w:lang w:val="en-US"/>
-        </w:rPr>
-        <w:t>9) NOT NULL,</w:t>
-      </w:r>
-    </w:p>
-    <w:p>
-      <w:pPr>
-        <w:ind w:left="708"/>
-        <w:rPr>
-          <w:iCs/>
-          <w:color w:val="auto"/>
-        </w:rPr>
-      </w:pPr>
-      <w:r>
-        <w:rPr>
-          <w:iCs/>
-          <w:color w:val="auto"/>
-          <w:lang w:val="en-US"/>
-        </w:rPr>
-        <w:t xml:space="preserve">    </w:t>
-      </w:r>
-      <w:proofErr w:type="spellStart"/>
-      <w:r>
-        <w:rPr>
-          <w:iCs/>
-          <w:color w:val="auto"/>
-        </w:rPr>
-        <w:t>endereco</w:t>
-      </w:r>
-      <w:proofErr w:type="spellEnd"/>
-      <w:r>
-        <w:rPr>
-          <w:iCs/>
-          <w:color w:val="auto"/>
-        </w:rPr>
-        <w:t xml:space="preserve"> </w:t>
-      </w:r>
-      <w:proofErr w:type="gramStart"/>
-      <w:r>
-        <w:rPr>
-          <w:iCs/>
-          <w:color w:val="auto"/>
-        </w:rPr>
-        <w:t>VARCHAR(</w:t>
-      </w:r>
-      <w:proofErr w:type="gramEnd"/>
-      <w:r>
-        <w:rPr>
-          <w:iCs/>
-          <w:color w:val="auto"/>
-        </w:rPr>
-        <w:t>255),</w:t>
-      </w:r>
-    </w:p>
-    <w:p>
-      <w:pPr>
-        <w:ind w:left="708"/>
-        <w:rPr>
-          <w:iCs/>
-          <w:color w:val="auto"/>
-        </w:rPr>
-      </w:pPr>
-      <w:r>
-        <w:rPr>
-          <w:iCs/>
-          <w:color w:val="auto"/>
-        </w:rPr>
-        <w:t xml:space="preserve">    </w:t>
-      </w:r>
-      <w:proofErr w:type="spellStart"/>
-      <w:r>
-        <w:rPr>
-          <w:iCs/>
-          <w:color w:val="auto"/>
-        </w:rPr>
-        <w:t>data_nasc</w:t>
-      </w:r>
-      <w:proofErr w:type="spellEnd"/>
-      <w:r>
-        <w:rPr>
-          <w:iCs/>
-          <w:color w:val="auto"/>
-        </w:rPr>
-        <w:t xml:space="preserve"> DATE,</w:t>
-      </w:r>
-    </w:p>
-    <w:p>
-      <w:pPr>
-        <w:ind w:left="708"/>
-        <w:rPr>
-          <w:iCs/>
-          <w:color w:val="auto"/>
-          <w:lang w:val="en-US"/>
-        </w:rPr>
-      </w:pPr>
-      <w:r>
-        <w:rPr>
-          <w:iCs/>
-          <w:color w:val="auto"/>
-        </w:rPr>
-        <w:t xml:space="preserve">    </w:t>
-      </w:r>
-      <w:r>
-        <w:rPr>
-          <w:iCs/>
-          <w:color w:val="auto"/>
-          <w:lang w:val="en-US"/>
-        </w:rPr>
-        <w:t xml:space="preserve">email </w:t>
-      </w:r>
-      <w:proofErr w:type="gramStart"/>
-      <w:r>
-        <w:rPr>
-          <w:iCs/>
-          <w:color w:val="auto"/>
-          <w:lang w:val="en-US"/>
-        </w:rPr>
-        <w:t>VARCHAR(</w:t>
-      </w:r>
-      <w:proofErr w:type="gramEnd"/>
-      <w:r>
-        <w:rPr>
-          <w:iCs/>
-          <w:color w:val="auto"/>
-          <w:lang w:val="en-US"/>
-        </w:rPr>
-        <w:t>150),</w:t>
-      </w:r>
-    </w:p>
-    <w:p>
-      <w:pPr>
-        <w:ind w:left="708"/>
-        <w:rPr>
-          <w:iCs/>
-          <w:color w:val="auto"/>
-          <w:lang w:val="en-US"/>
-        </w:rPr>
-      </w:pPr>
-      <w:r>
-        <w:rPr>
-          <w:iCs/>
-          <w:color w:val="auto"/>
-          <w:lang w:val="en-US"/>
-        </w:rPr>
-        <w:t xml:space="preserve">    </w:t>
-      </w:r>
-      <w:proofErr w:type="spellStart"/>
-      <w:r>
-        <w:rPr>
-          <w:iCs/>
-          <w:color w:val="auto"/>
-          <w:lang w:val="en-US"/>
-        </w:rPr>
-        <w:t>data_cad</w:t>
-      </w:r>
-      <w:proofErr w:type="spellEnd"/>
-      <w:r>
-        <w:rPr>
-          <w:iCs/>
-          <w:color w:val="auto"/>
-          <w:lang w:val="en-US"/>
-        </w:rPr>
-        <w:t xml:space="preserve"> TIMESTAMP DEFAULT CURRENT_TIMESTAMP,</w:t>
-      </w:r>
-    </w:p>
-    <w:p>
-      <w:pPr>
-        <w:ind w:left="708"/>
-        <w:rPr>
-          <w:iCs/>
-          <w:color w:val="auto"/>
-          <w:lang w:val="en-US"/>
-        </w:rPr>
-      </w:pPr>
-      <w:r>
-        <w:rPr>
-          <w:iCs/>
-          <w:color w:val="auto"/>
-          <w:lang w:val="en-US"/>
-        </w:rPr>
-        <w:t xml:space="preserve">    </w:t>
-      </w:r>
-      <w:proofErr w:type="spellStart"/>
-      <w:r>
-        <w:rPr>
-          <w:iCs/>
-          <w:color w:val="auto"/>
-          <w:lang w:val="en-US"/>
-        </w:rPr>
-        <w:t>senha</w:t>
-      </w:r>
-      <w:proofErr w:type="spellEnd"/>
-      <w:r>
-        <w:rPr>
-          <w:iCs/>
-          <w:color w:val="auto"/>
-          <w:lang w:val="en-US"/>
-        </w:rPr>
-        <w:t xml:space="preserve"> </w:t>
-      </w:r>
-      <w:proofErr w:type="gramStart"/>
-      <w:r>
-        <w:rPr>
-          <w:iCs/>
-          <w:color w:val="auto"/>
-          <w:lang w:val="en-US"/>
-        </w:rPr>
-        <w:t>VARCHAR(</w:t>
-      </w:r>
-      <w:proofErr w:type="gramEnd"/>
-      <w:r>
-        <w:rPr>
-          <w:iCs/>
-          <w:color w:val="auto"/>
-          <w:lang w:val="en-US"/>
-        </w:rPr>
-        <w:t>255) NOT NULL,</w:t>
-      </w:r>
-    </w:p>
-    <w:p>
-      <w:pPr>
-        <w:ind w:left="708"/>
-        <w:rPr>
-          <w:iCs/>
-          <w:color w:val="auto"/>
-          <w:lang w:val="en-US"/>
-        </w:rPr>
-      </w:pPr>
-      <w:r>
-        <w:rPr>
-          <w:iCs/>
-          <w:color w:val="auto"/>
-          <w:lang w:val="en-US"/>
-        </w:rPr>
-        <w:t xml:space="preserve">    </w:t>
-      </w:r>
-      <w:proofErr w:type="spellStart"/>
-      <w:r>
-        <w:rPr>
-          <w:iCs/>
-          <w:color w:val="auto"/>
-          <w:lang w:val="en-US"/>
-        </w:rPr>
-        <w:t>usuario_valido</w:t>
-      </w:r>
-      <w:proofErr w:type="spellEnd"/>
-      <w:r>
-        <w:rPr>
-          <w:iCs/>
-          <w:color w:val="auto"/>
-          <w:lang w:val="en-US"/>
-        </w:rPr>
-        <w:t xml:space="preserve"> BOOLEAN DEFAULT FALSE</w:t>
-      </w:r>
-      <w:r>
-        <w:rPr>
-          <w:iCs/>
-          <w:color w:val="auto"/>
-          <w:lang w:val="en-US"/>
-        </w:rPr>
-        <w:t>,</w:t>
-      </w:r>
-    </w:p>
-    <w:p>
-      <w:pPr>
-        <w:ind w:left="708"/>
-        <w:rPr>
-          <w:iCs/>
-          <w:color w:val="auto"/>
-        </w:rPr>
-      </w:pPr>
-      <w:r>
-        <w:rPr>
-          <w:iCs/>
-          <w:color w:val="auto"/>
-          <w:lang w:val="en-US"/>
-        </w:rPr>
-        <w:t xml:space="preserve">    </w:t>
-      </w:r>
-      <w:r>
-        <w:rPr>
-          <w:iCs/>
-          <w:color w:val="auto"/>
-        </w:rPr>
-        <w:t>administrador BOOLEAN DEFAULT FALSE);</w:t>
-      </w:r>
-    </w:p>
-    <w:p>
-      <w:pPr>
-        <w:ind w:left="708"/>
-        <w:rPr>
-          <w:iCs/>
-          <w:color w:val="auto"/>
-        </w:rPr>
-      </w:pPr>
-    </w:p>
-    <w:p>
-      <w:pPr>
-        <w:ind w:left="708"/>
-        <w:rPr>
-          <w:iCs/>
-          <w:color w:val="auto"/>
-        </w:rPr>
-      </w:pPr>
-      <w:r>
-        <w:rPr>
-          <w:iCs/>
-          <w:color w:val="auto"/>
-        </w:rPr>
-        <w:t xml:space="preserve">INSERT INTO </w:t>
-      </w:r>
-      <w:proofErr w:type="spellStart"/>
-      <w:r>
-        <w:rPr>
-          <w:iCs/>
-          <w:color w:val="auto"/>
-        </w:rPr>
-        <w:t>usuarios</w:t>
-      </w:r>
-      <w:proofErr w:type="spellEnd"/>
-      <w:r>
-        <w:rPr>
-          <w:iCs/>
-          <w:color w:val="auto"/>
-        </w:rPr>
-        <w:t xml:space="preserve"> (id, nome, </w:t>
-      </w:r>
-      <w:proofErr w:type="gramStart"/>
-      <w:r>
-        <w:rPr>
-          <w:iCs/>
-          <w:color w:val="auto"/>
-        </w:rPr>
-        <w:t>matricula</w:t>
-      </w:r>
-      <w:proofErr w:type="gramEnd"/>
-      <w:r>
-        <w:rPr>
-          <w:iCs/>
-          <w:color w:val="auto"/>
-        </w:rPr>
-        <w:t xml:space="preserve">, </w:t>
-      </w:r>
-      <w:proofErr w:type="spellStart"/>
-      <w:r>
-        <w:rPr>
-          <w:iCs/>
-          <w:color w:val="auto"/>
-        </w:rPr>
-        <w:t>endereco</w:t>
-      </w:r>
-      <w:proofErr w:type="spellEnd"/>
-      <w:r>
-        <w:rPr>
-          <w:iCs/>
-          <w:color w:val="auto"/>
-        </w:rPr>
-        <w:t xml:space="preserve">, </w:t>
-      </w:r>
-      <w:proofErr w:type="spellStart"/>
-      <w:r>
-        <w:rPr>
-          <w:iCs/>
-          <w:color w:val="auto"/>
-        </w:rPr>
-        <w:t>data_nasc</w:t>
-      </w:r>
-      <w:proofErr w:type="spellEnd"/>
-      <w:r>
-        <w:rPr>
-          <w:iCs/>
-          <w:color w:val="auto"/>
-        </w:rPr>
-        <w:t xml:space="preserve">, </w:t>
-      </w:r>
-      <w:proofErr w:type="spellStart"/>
-      <w:r>
-        <w:rPr>
-          <w:iCs/>
-          <w:color w:val="auto"/>
-        </w:rPr>
-        <w:t>email</w:t>
-      </w:r>
-      <w:proofErr w:type="spellEnd"/>
-      <w:r>
-        <w:rPr>
-          <w:iCs/>
-          <w:color w:val="auto"/>
-        </w:rPr>
-        <w:t xml:space="preserve">, senha, </w:t>
-      </w:r>
-      <w:proofErr w:type="spellStart"/>
-      <w:r>
-        <w:rPr>
-          <w:iCs/>
-          <w:color w:val="auto"/>
-        </w:rPr>
-        <w:t>usuario_valido</w:t>
-      </w:r>
-      <w:proofErr w:type="spellEnd"/>
-      <w:r>
-        <w:rPr>
-          <w:iCs/>
-          <w:color w:val="auto"/>
-        </w:rPr>
-        <w:t>, administrador)</w:t>
-      </w:r>
-      <w:r>
-        <w:rPr>
-          <w:iCs/>
-          <w:color w:val="auto"/>
-        </w:rPr>
-        <w:t xml:space="preserve"> </w:t>
-      </w:r>
-      <w:r>
-        <w:rPr>
-          <w:iCs/>
-          <w:color w:val="auto"/>
-        </w:rPr>
-        <w:t xml:space="preserve">VALUES (1, 'admin', 3050111, 'IFSP - Salto', '2000-01-01', 'admin@gmail.com', 123456, </w:t>
-      </w:r>
-      <w:proofErr w:type="spellStart"/>
-      <w:r>
-        <w:rPr>
-          <w:iCs/>
-          <w:color w:val="auto"/>
-        </w:rPr>
-        <w:t>true</w:t>
-      </w:r>
-      <w:proofErr w:type="spellEnd"/>
-      <w:r>
-        <w:rPr>
-          <w:iCs/>
-          <w:color w:val="auto"/>
-        </w:rPr>
-        <w:t xml:space="preserve">, </w:t>
-      </w:r>
-      <w:proofErr w:type="spellStart"/>
-      <w:r>
-        <w:rPr>
-          <w:iCs/>
-          <w:color w:val="auto"/>
-        </w:rPr>
-        <w:t>true</w:t>
-      </w:r>
-      <w:proofErr w:type="spellEnd"/>
-      <w:r>
-        <w:rPr>
-          <w:iCs/>
-          <w:color w:val="auto"/>
-        </w:rPr>
-        <w:t>)</w:t>
+      <w:r>
+        <w:rPr>
+          <w:iCs/>
+          <w:color w:val="auto"/>
+        </w:rPr>
+        <w:t>VALUES (1, 'admin', 3050111, 'IFSP - Salto', '2000-01-01', 'admin@gmail.com', 123456, true, true)</w:t>
       </w:r>
       <w:r>
         <w:rPr>
@@ -5330,19 +4532,8 @@
           <w:sz w:val="22"/>
           <w:szCs w:val="22"/>
         </w:rPr>
-        <w:t>: Baixar Repositório e copiar .</w:t>
-      </w:r>
-      <w:proofErr w:type="spellStart"/>
-      <w:r>
-        <w:rPr>
-          <w:b/>
-          <w:bCs/>
-          <w:sz w:val="22"/>
-          <w:szCs w:val="22"/>
-        </w:rPr>
-        <w:t>war</w:t>
-      </w:r>
-      <w:proofErr w:type="spellEnd"/>
+        <w:t>: Baixar Repositório e copiar .war</w:t>
+      </w:r>
     </w:p>
     <w:p>
       <w:pPr>
@@ -5374,23 +4565,7 @@
         </w:numPr>
       </w:pPr>
       <w:r>
-        <w:t>Siga o caminho “3. Implementação” -&gt; “código-fonte” -&gt; selecione a Branch “</w:t>
-      </w:r>
-      <w:proofErr w:type="spellStart"/>
-      <w:r>
-        <w:t>main</w:t>
-      </w:r>
-      <w:proofErr w:type="spellEnd"/>
-      <w:r>
-        <w:t>” -&gt; clique em “</w:t>
-      </w:r>
-      <w:proofErr w:type="spellStart"/>
-      <w:r>
-        <w:t>Code</w:t>
-      </w:r>
-      <w:proofErr w:type="spellEnd"/>
-      <w:r>
-        <w:t>” e depois em “Download .ZIP”.</w:t>
+        <w:t>Siga o caminho “3. Implementação” -&gt; “código-fonte” -&gt; selecione a Branch “main” -&gt; clique em “Code” e depois em “Download .ZIP”.</w:t>
       </w:r>
     </w:p>
     <w:p>
@@ -5428,7 +4603,6 @@
           <w:sz w:val="22"/>
           <w:szCs w:val="22"/>
         </w:rPr>
-        <w:lastRenderedPageBreak/>
         <w:t xml:space="preserve">Passo </w:t>
       </w:r>
       <w:r>
@@ -5447,39 +4621,8 @@
           <w:sz w:val="22"/>
           <w:szCs w:val="22"/>
         </w:rPr>
-        <w:t xml:space="preserve">: </w:t>
-      </w:r>
-      <w:proofErr w:type="spellStart"/>
-      <w:r>
-        <w:rPr>
-          <w:b/>
-          <w:bCs/>
-          <w:sz w:val="22"/>
-          <w:szCs w:val="22"/>
-        </w:rPr>
-        <w:t>Deploy</w:t>
-      </w:r>
-      <w:proofErr w:type="spellEnd"/>
-      <w:r>
-        <w:rPr>
-          <w:b/>
-          <w:bCs/>
-          <w:sz w:val="22"/>
-          <w:szCs w:val="22"/>
-        </w:rPr>
-        <w:t xml:space="preserve"> no Apache </w:t>
-      </w:r>
-      <w:proofErr w:type="spellStart"/>
-      <w:r>
-        <w:rPr>
-          <w:b/>
-          <w:bCs/>
-          <w:sz w:val="22"/>
-          <w:szCs w:val="22"/>
-        </w:rPr>
-        <w:t>Tomcat</w:t>
-      </w:r>
-      <w:proofErr w:type="spellEnd"/>
+        <w:t>: Deploy no Apache Tomcat</w:t>
+      </w:r>
     </w:p>
     <w:p>
       <w:pPr>
@@ -5497,31 +4640,7 @@
         </w:numPr>
       </w:pPr>
       <w:r>
-        <w:t xml:space="preserve">Abra a pasta </w:t>
-      </w:r>
-      <w:proofErr w:type="spellStart"/>
-      <w:r>
-        <w:t>raíz</w:t>
-      </w:r>
-      <w:proofErr w:type="spellEnd"/>
-      <w:r>
-        <w:t xml:space="preserve"> do </w:t>
-      </w:r>
-      <w:proofErr w:type="spellStart"/>
-      <w:r>
-        <w:t>Tomcat</w:t>
-      </w:r>
-      <w:proofErr w:type="spellEnd"/>
-      <w:r>
-        <w:t xml:space="preserve"> e abra a pasta “</w:t>
-      </w:r>
-      <w:proofErr w:type="spellStart"/>
-      <w:r>
-        <w:t>webapps</w:t>
-      </w:r>
-      <w:proofErr w:type="spellEnd"/>
-      <w:r>
-        <w:t>”</w:t>
+        <w:t>Abra a pasta raíz do Tomcat e abra a pasta “webapps”</w:t>
       </w:r>
     </w:p>
     <w:p>
@@ -5538,31 +4657,7 @@
         <w:t xml:space="preserve"> “inst360.war”</w:t>
       </w:r>
       <w:r>
-        <w:t xml:space="preserve"> dentro do diretório </w:t>
-      </w:r>
-      <w:proofErr w:type="spellStart"/>
-      <w:r>
-        <w:t>webapps</w:t>
-      </w:r>
-      <w:proofErr w:type="spellEnd"/>
-      <w:r>
-        <w:t xml:space="preserve"> da instalação do seu </w:t>
-      </w:r>
-      <w:proofErr w:type="spellStart"/>
-      <w:r>
-        <w:t>Tomcat</w:t>
-      </w:r>
-      <w:proofErr w:type="spellEnd"/>
-      <w:r>
-        <w:t xml:space="preserve"> (</w:t>
-      </w:r>
-      <w:proofErr w:type="spellStart"/>
-      <w:r>
-        <w:t>Ex</w:t>
-      </w:r>
-      <w:proofErr w:type="spellEnd"/>
-      <w:r>
-        <w:t>: C:\apache-tomcat-10.x\webapps\).</w:t>
+        <w:t xml:space="preserve"> dentro do diretório webapps da instalação do seu Tomcat (Ex: C:\apache-tomcat-10.x\webapps\).</w:t>
       </w:r>
     </w:p>
     <w:p>
@@ -5573,15 +4668,7 @@
         </w:numPr>
       </w:pPr>
       <w:r>
-        <w:t xml:space="preserve">Acesse a pasta bin do </w:t>
-      </w:r>
-      <w:proofErr w:type="spellStart"/>
-      <w:r>
-        <w:t>Tomcat</w:t>
-      </w:r>
-      <w:proofErr w:type="spellEnd"/>
-      <w:r>
-        <w:t xml:space="preserve"> (C:\apache-tomcat-10.x\bin\) e dê um duplo clique no arquivo startup.bat para iniciar o servidor.</w:t>
+        <w:t>Acesse a pasta bin do Tomcat (C:\apache-tomcat-10.x\bin\) e dê um duplo clique no arquivo startup.bat para iniciar o servidor.</w:t>
       </w:r>
     </w:p>
     <w:p/>
@@ -5741,43 +4828,7 @@
           <w:sz w:val="22"/>
           <w:szCs w:val="22"/>
         </w:rPr>
-        <w:t xml:space="preserve">Infraestrutura e Software: Monitoramento de uso de CPU/Memória do </w:t>
-      </w:r>
-      <w:proofErr w:type="spellStart"/>
-      <w:r>
-        <w:rPr>
-          <w:color w:val="auto"/>
-          <w:sz w:val="22"/>
-          <w:szCs w:val="22"/>
-        </w:rPr>
-        <w:t>Tomcat</w:t>
-      </w:r>
-      <w:proofErr w:type="spellEnd"/>
-      <w:r>
-        <w:rPr>
-          <w:color w:val="auto"/>
-          <w:sz w:val="22"/>
-          <w:szCs w:val="22"/>
-        </w:rPr>
-        <w:t xml:space="preserve"> e logs de erro (</w:t>
-      </w:r>
-      <w:proofErr w:type="spellStart"/>
-      <w:r>
-        <w:rPr>
-          <w:color w:val="auto"/>
-          <w:sz w:val="22"/>
-          <w:szCs w:val="22"/>
-        </w:rPr>
-        <w:t>catalina.out</w:t>
-      </w:r>
-      <w:proofErr w:type="spellEnd"/>
-      <w:r>
-        <w:rPr>
-          <w:color w:val="auto"/>
-          <w:sz w:val="22"/>
-          <w:szCs w:val="22"/>
-        </w:rPr>
-        <w:t>) durante os primeiros 30 dias.</w:t>
+        <w:t>Infraestrutura e Software: Monitoramento de uso de CPU/Memória do Tomcat e logs de erro (catalina.out) durante os primeiros 30 dias.</w:t>
       </w:r>
       <w:r>
         <w:rPr>
@@ -5973,15 +5024,7 @@
             <w:pStyle w:val="Rodap"/>
           </w:pPr>
           <w:r>
-            <w:t>ITQ- X.X-</w:t>
-          </w:r>
-          <w:proofErr w:type="gramStart"/>
-          <w:r>
-            <w:t>XX.XX</w:t>
-          </w:r>
-          <w:proofErr w:type="gramEnd"/>
-          <w:r>
-            <w:t xml:space="preserve"> – Nome da ITQ</w:t>
+            <w:t>ITQ- X.X-XX.XX – Nome da ITQ</w:t>
           </w:r>
         </w:p>
       </w:tc>
@@ -6237,13 +5280,8 @@
       <w:pStyle w:val="Rodap"/>
       <w:jc w:val="right"/>
     </w:pPr>
-    <w:proofErr w:type="spellStart"/>
     <w:r>
-      <w:t>vs</w:t>
-    </w:r>
-    <w:proofErr w:type="spellEnd"/>
-    <w:r>
-      <w:t xml:space="preserve">: </w:t>
+      <w:t xml:space="preserve">vs: </w:t>
     </w:r>
     <w:fldSimple w:instr=" DOCPROPERTY  &quot;Versão Modelo&quot;  \* MERGEFORMAT ">
       <w:r>
@@ -6339,19 +5377,11 @@
               <w:lang w:val="pt-PT"/>
             </w:rPr>
           </w:pPr>
-          <w:proofErr w:type="spellStart"/>
           <w:r>
             <w:rPr>
               <w:bCs/>
             </w:rPr>
-            <w:t>Nomde</w:t>
-          </w:r>
-          <w:proofErr w:type="spellEnd"/>
-          <w:r>
-            <w:rPr>
-              <w:bCs/>
-            </w:rPr>
-            <w:t xml:space="preserve"> do MF</w:t>
+            <w:t>Nomde do MF</w:t>
           </w:r>
         </w:p>
       </w:tc>
@@ -6392,10 +5422,10 @@
                 <v:path o:extrusionok="f" gradientshapeok="t" o:connecttype="rect"/>
                 <o:lock v:ext="edit" aspectratio="t"/>
               </v:shapetype>
-              <v:shape id="_x0000_i1025" type="#_x0000_t75" style="width:61.5pt;height:34.5pt">
+              <v:shape id="_x0000_i1025" type="#_x0000_t75" style="width:61.8pt;height:34.8pt">
                 <v:imagedata r:id="rId1" o:title=""/>
               </v:shape>
-              <o:OLEObject Type="Embed" ProgID="Word.Picture.8" ShapeID="_x0000_i1025" DrawAspect="Content" ObjectID="_1842611898" r:id="rId2"/>
+              <o:OLEObject Type="Embed" ProgID="Word.Picture.8" ShapeID="_x0000_i1025" DrawAspect="Content" ObjectID="_1843148916" r:id="rId2"/>
             </w:object>
           </w:r>
         </w:p>
@@ -9966,12 +8996,14 @@
     <w:rsid w:val="00321402"/>
     <w:rsid w:val="00491FAF"/>
     <w:rsid w:val="005055FB"/>
+    <w:rsid w:val="00952C42"/>
     <w:rsid w:val="009C5FC4"/>
     <w:rsid w:val="00A179EA"/>
     <w:rsid w:val="00A37874"/>
     <w:rsid w:val="00B300A0"/>
     <w:rsid w:val="00C617C0"/>
     <w:rsid w:val="00D531CA"/>
+    <w:rsid w:val="00E11F9C"/>
     <w:rsid w:val="00E87FAF"/>
   </w:rsids>
   <m:mathPr>

</xml_diff>